<commit_message>
Actualizar el documento del Sprint 3 con las observaciones de la revision
</commit_message>
<xml_diff>
--- a/Documentos/AEUVG - Desarrollo Sprint 3.docx
+++ b/Documentos/AEUVG - Desarrollo Sprint 3.docx
@@ -2087,6 +2087,20 @@
           <w:szCs w:val="24"/>
         </w:rPr>
         <w:t xml:space="preserve">Queda pendiente de AEUVG la carga de la información real de las asociaciones y clubes del campus, incluidas las fotografías de sus juntas directivas. No bloquea el sprint: la administración quedó lista y el módulo funciona con la información de prueba. Continúa también en gestión el trámite del dominio institucional iniciado en el Sprint 1.</w:t>
+      </w:r>
+    </w:p>
+    <w:p>
+      <w:pPr>
+        <w:spacing w:after="160" w:line="300"/>
+        <w:jc w:val="both"/>
+      </w:pPr>
+      <w:r>
+        <w:rPr>
+          <w:rFonts w:ascii="Times New Roman" w:cs="Times New Roman" w:eastAsia="Times New Roman" w:hAnsi="Times New Roman"/>
+          <w:sz w:val="24"/>
+          <w:szCs w:val="24"/>
+        </w:rPr>
+        <w:t xml:space="preserve">Tras la revisión del sprint se incorporaron las observaciones recibidas, sin alcance nuevo: el listado del panel deshabilita la eliminación de una organización que organiza eventos y explica en la misma fila por qué, ya que el botón invitaba a intentarlo solo para enterarse; cada fila del panel enlaza además a la ficha pública, para comprobar cómo quedó sin tener que buscarla en el listado del sitio; el perfil presenta el teléfono entre sus datos visibles, que antes solo aparecía dentro del formulario, de modo que quien entraba a revisar sus datos no sabía si lo tenía registrado; y la sección de eventos guardados muestra su total, porque con varias tarjetas repartidas en dos bloques no quedaba claro cuántos había.</w:t>
       </w:r>
     </w:p>
     <w:p>

</xml_diff>

<commit_message>
Actualizar el registro de tiempos del Sprint 3 con el cierre completo
</commit_message>
<xml_diff>
--- a/Documentos/AEUVG - Desarrollo Sprint 3.docx
+++ b/Documentos/AEUVG - Desarrollo Sprint 3.docx
@@ -1920,7 +1920,7 @@
           <w:sz w:val="24"/>
           <w:szCs w:val="24"/>
         </w:rPr>
-        <w:t xml:space="preserve">Las seis historias comprometidas para el Sprint 3 se encuentran completadas, con 26.4 horas de trabajo de equipo frente a las 28 estimadas. El detalle por sesión se encuentra en la sección 10. La plataforma cuenta ahora con:</w:t>
+        <w:t xml:space="preserve">Las seis historias comprometidas para el Sprint 3 se encuentran completadas, con 28.5 horas de trabajo de equipo frente a las 28 estimadas. El detalle por sesión se encuentra en la sección 10. La plataforma cuenta ahora con:</w:t>
       </w:r>
     </w:p>
     <w:p>
@@ -2173,7 +2173,7 @@
           <w:sz w:val="24"/>
           <w:szCs w:val="24"/>
         </w:rPr>
-        <w:t xml:space="preserve">El sprint sumó 26.4 horas de equipo: 16.3 horas de Harry Méndez y 10.2 horas de Juan Gabriel Gualim, frente a las 28 horas estimadas en la planificación, es decir, un 6% por debajo de lo previsto. La estimación se calculó con la velocidad medida en el Sprint 2 y este sprint reutilizó los componentes de listado, paginación, estado vacío y carga de imágenes construidos en aquel, lo que mantuvo el tiempo real cerca de lo previsto.</w:t>
+        <w:t xml:space="preserve">El sprint sumó 28.5 horas de equipo: 17.5 horas de Harry Méndez y 11.0 horas de Juan Gabriel Gualim, frente a las 28 horas estimadas en la planificación, es decir, un 2% por encima de lo previsto. La estimación se calculó con la velocidad medida en el Sprint 2 y este sprint reutilizó los componentes de listado, paginación, estado vacío y carga de imágenes construidos en aquel, lo que mantuvo el tiempo real cerca de lo previsto. La diferencia corresponde al día de cierre: la revisión con AEUVG dejó observaciones que se resolvieron el mismo 7 de octubre, antes de publicar la versión final del sprint.</w:t>
       </w:r>
     </w:p>
     <w:p>
@@ -5541,6 +5541,190 @@
           </w:p>
         </w:tc>
       </w:tr>
+      <w:tr>
+        <w:tc>
+          <w:tcPr>
+            <w:tcW w:type="dxa" w:w="900"/>
+            <w:tcMar>
+              <w:top w:type="dxa" w:w="80"/>
+              <w:left w:type="dxa" w:w="120"/>
+              <w:bottom w:type="dxa" w:w="80"/>
+              <w:right w:type="dxa" w:w="120"/>
+            </w:tcMar>
+          </w:tcPr>
+          <w:p>
+            <w:pPr>
+              <w:spacing w:after="0"/>
+            </w:pPr>
+            <w:r>
+              <w:rPr>
+                <w:rFonts w:ascii="Times New Roman" w:cs="Times New Roman" w:eastAsia="Times New Roman" w:hAnsi="Times New Roman"/>
+                <w:b w:val="false"/>
+                <w:bCs w:val="false"/>
+                <w:sz w:val="24"/>
+                <w:szCs w:val="24"/>
+              </w:rPr>
+              <w:t xml:space="preserve">07/10/2026</w:t>
+            </w:r>
+          </w:p>
+        </w:tc>
+        <w:tc>
+          <w:tcPr>
+            <w:tcW w:type="dxa" w:w="680"/>
+            <w:tcMar>
+              <w:top w:type="dxa" w:w="80"/>
+              <w:left w:type="dxa" w:w="120"/>
+              <w:bottom w:type="dxa" w:w="80"/>
+              <w:right w:type="dxa" w:w="120"/>
+            </w:tcMar>
+          </w:tcPr>
+          <w:p>
+            <w:pPr>
+              <w:spacing w:after="0"/>
+            </w:pPr>
+            <w:r>
+              <w:rPr>
+                <w:rFonts w:ascii="Times New Roman" w:cs="Times New Roman" w:eastAsia="Times New Roman" w:hAnsi="Times New Roman"/>
+                <w:b w:val="false"/>
+                <w:bCs w:val="false"/>
+                <w:sz w:val="24"/>
+                <w:szCs w:val="24"/>
+              </w:rPr>
+              <w:t xml:space="preserve">15:40</w:t>
+            </w:r>
+          </w:p>
+        </w:tc>
+        <w:tc>
+          <w:tcPr>
+            <w:tcW w:type="dxa" w:w="680"/>
+            <w:tcMar>
+              <w:top w:type="dxa" w:w="80"/>
+              <w:left w:type="dxa" w:w="120"/>
+              <w:bottom w:type="dxa" w:w="80"/>
+              <w:right w:type="dxa" w:w="120"/>
+            </w:tcMar>
+          </w:tcPr>
+          <w:p>
+            <w:pPr>
+              <w:spacing w:after="0"/>
+            </w:pPr>
+            <w:r>
+              <w:rPr>
+                <w:rFonts w:ascii="Times New Roman" w:cs="Times New Roman" w:eastAsia="Times New Roman" w:hAnsi="Times New Roman"/>
+                <w:b w:val="false"/>
+                <w:bCs w:val="false"/>
+                <w:sz w:val="24"/>
+                <w:szCs w:val="24"/>
+              </w:rPr>
+              <w:t xml:space="preserve">17:10</w:t>
+            </w:r>
+          </w:p>
+        </w:tc>
+        <w:tc>
+          <w:tcPr>
+            <w:tcW w:type="dxa" w:w="1120"/>
+            <w:tcMar>
+              <w:top w:type="dxa" w:w="80"/>
+              <w:left w:type="dxa" w:w="120"/>
+              <w:bottom w:type="dxa" w:w="80"/>
+              <w:right w:type="dxa" w:w="120"/>
+            </w:tcMar>
+          </w:tcPr>
+          <w:p>
+            <w:pPr>
+              <w:spacing w:after="0"/>
+            </w:pPr>
+            <w:r>
+              <w:rPr>
+                <w:rFonts w:ascii="Times New Roman" w:cs="Times New Roman" w:eastAsia="Times New Roman" w:hAnsi="Times New Roman"/>
+                <w:b w:val="false"/>
+                <w:bCs w:val="false"/>
+                <w:sz w:val="24"/>
+                <w:szCs w:val="24"/>
+              </w:rPr>
+              <w:t xml:space="preserve">0:15</w:t>
+            </w:r>
+          </w:p>
+        </w:tc>
+        <w:tc>
+          <w:tcPr>
+            <w:tcW w:type="dxa" w:w="900"/>
+            <w:tcMar>
+              <w:top w:type="dxa" w:w="80"/>
+              <w:left w:type="dxa" w:w="120"/>
+              <w:bottom w:type="dxa" w:w="80"/>
+              <w:right w:type="dxa" w:w="120"/>
+            </w:tcMar>
+          </w:tcPr>
+          <w:p>
+            <w:pPr>
+              <w:spacing w:after="0"/>
+            </w:pPr>
+            <w:r>
+              <w:rPr>
+                <w:rFonts w:ascii="Times New Roman" w:cs="Times New Roman" w:eastAsia="Times New Roman" w:hAnsi="Times New Roman"/>
+                <w:b w:val="false"/>
+                <w:bCs w:val="false"/>
+                <w:sz w:val="24"/>
+                <w:szCs w:val="24"/>
+              </w:rPr>
+              <w:t xml:space="preserve">1:15</w:t>
+            </w:r>
+          </w:p>
+        </w:tc>
+        <w:tc>
+          <w:tcPr>
+            <w:tcW w:type="dxa" w:w="1280"/>
+            <w:tcMar>
+              <w:top w:type="dxa" w:w="80"/>
+              <w:left w:type="dxa" w:w="120"/>
+              <w:bottom w:type="dxa" w:w="80"/>
+              <w:right w:type="dxa" w:w="120"/>
+            </w:tcMar>
+          </w:tcPr>
+          <w:p>
+            <w:pPr>
+              <w:spacing w:after="0"/>
+            </w:pPr>
+            <w:r>
+              <w:rPr>
+                <w:rFonts w:ascii="Times New Roman" w:cs="Times New Roman" w:eastAsia="Times New Roman" w:hAnsi="Times New Roman"/>
+                <w:b w:val="false"/>
+                <w:bCs w:val="false"/>
+                <w:sz w:val="24"/>
+                <w:szCs w:val="24"/>
+              </w:rPr>
+              <w:t xml:space="preserve">Codificación</w:t>
+            </w:r>
+          </w:p>
+        </w:tc>
+        <w:tc>
+          <w:tcPr>
+            <w:tcW w:type="dxa" w:w="3800"/>
+            <w:tcMar>
+              <w:top w:type="dxa" w:w="80"/>
+              <w:left w:type="dxa" w:w="120"/>
+              <w:bottom w:type="dxa" w:w="80"/>
+              <w:right w:type="dxa" w:w="120"/>
+            </w:tcMar>
+          </w:tcPr>
+          <w:p>
+            <w:pPr>
+              <w:spacing w:after="0"/>
+            </w:pPr>
+            <w:r>
+              <w:rPr>
+                <w:rFonts w:ascii="Times New Roman" w:cs="Times New Roman" w:eastAsia="Times New Roman" w:hAnsi="Times New Roman"/>
+                <w:b w:val="false"/>
+                <w:bCs w:val="false"/>
+                <w:sz w:val="24"/>
+                <w:szCs w:val="24"/>
+              </w:rPr>
+              <w:t xml:space="preserve">AEUVG-136 Eliminación deshabilitada con su explicación. AEUVG-138 Teléfono entre los datos del perfil. Integración de los ajustes a main.</w:t>
+            </w:r>
+          </w:p>
+        </w:tc>
+      </w:tr>
     </w:tbl>
     <w:p>
       <w:pPr>
@@ -6064,7 +6248,7 @@
                 <w:sz w:val="24"/>
                 <w:szCs w:val="24"/>
               </w:rPr>
-              <w:t xml:space="preserve">3.8</w:t>
+              <w:t xml:space="preserve">3.7</w:t>
             </w:r>
           </w:p>
         </w:tc>
@@ -6278,7 +6462,7 @@
                 <w:sz w:val="24"/>
                 <w:szCs w:val="24"/>
               </w:rPr>
-              <w:t xml:space="preserve">0:55</w:t>
+              <w:t xml:space="preserve">2:10</w:t>
             </w:r>
           </w:p>
         </w:tc>
@@ -6304,7 +6488,7 @@
                 <w:sz w:val="24"/>
                 <w:szCs w:val="24"/>
               </w:rPr>
-              <w:t xml:space="preserve">0.9</w:t>
+              <w:t xml:space="preserve">2.2</w:t>
             </w:r>
           </w:p>
         </w:tc>
@@ -6438,7 +6622,7 @@
                 <w:sz w:val="24"/>
                 <w:szCs w:val="24"/>
               </w:rPr>
-              <w:t xml:space="preserve">16:15</w:t>
+              <w:t xml:space="preserve">17:30</w:t>
             </w:r>
           </w:p>
         </w:tc>
@@ -6464,7 +6648,7 @@
                 <w:sz w:val="24"/>
                 <w:szCs w:val="24"/>
               </w:rPr>
-              <w:t xml:space="preserve">16.3</w:t>
+              <w:t xml:space="preserve">17.5</w:t>
             </w:r>
           </w:p>
         </w:tc>
@@ -8915,6 +9099,190 @@
           </w:p>
         </w:tc>
       </w:tr>
+      <w:tr>
+        <w:tc>
+          <w:tcPr>
+            <w:tcW w:type="dxa" w:w="900"/>
+            <w:tcMar>
+              <w:top w:type="dxa" w:w="80"/>
+              <w:left w:type="dxa" w:w="120"/>
+              <w:bottom w:type="dxa" w:w="80"/>
+              <w:right w:type="dxa" w:w="120"/>
+            </w:tcMar>
+          </w:tcPr>
+          <w:p>
+            <w:pPr>
+              <w:spacing w:after="0"/>
+            </w:pPr>
+            <w:r>
+              <w:rPr>
+                <w:rFonts w:ascii="Times New Roman" w:cs="Times New Roman" w:eastAsia="Times New Roman" w:hAnsi="Times New Roman"/>
+                <w:b w:val="false"/>
+                <w:bCs w:val="false"/>
+                <w:sz w:val="24"/>
+                <w:szCs w:val="24"/>
+              </w:rPr>
+              <w:t xml:space="preserve">07/10/2026</w:t>
+            </w:r>
+          </w:p>
+        </w:tc>
+        <w:tc>
+          <w:tcPr>
+            <w:tcW w:type="dxa" w:w="680"/>
+            <w:tcMar>
+              <w:top w:type="dxa" w:w="80"/>
+              <w:left w:type="dxa" w:w="120"/>
+              <w:bottom w:type="dxa" w:w="80"/>
+              <w:right w:type="dxa" w:w="120"/>
+            </w:tcMar>
+          </w:tcPr>
+          <w:p>
+            <w:pPr>
+              <w:spacing w:after="0"/>
+            </w:pPr>
+            <w:r>
+              <w:rPr>
+                <w:rFonts w:ascii="Times New Roman" w:cs="Times New Roman" w:eastAsia="Times New Roman" w:hAnsi="Times New Roman"/>
+                <w:b w:val="false"/>
+                <w:bCs w:val="false"/>
+                <w:sz w:val="24"/>
+                <w:szCs w:val="24"/>
+              </w:rPr>
+              <w:t xml:space="preserve">15:50</w:t>
+            </w:r>
+          </w:p>
+        </w:tc>
+        <w:tc>
+          <w:tcPr>
+            <w:tcW w:type="dxa" w:w="680"/>
+            <w:tcMar>
+              <w:top w:type="dxa" w:w="80"/>
+              <w:left w:type="dxa" w:w="120"/>
+              <w:bottom w:type="dxa" w:w="80"/>
+              <w:right w:type="dxa" w:w="120"/>
+            </w:tcMar>
+          </w:tcPr>
+          <w:p>
+            <w:pPr>
+              <w:spacing w:after="0"/>
+            </w:pPr>
+            <w:r>
+              <w:rPr>
+                <w:rFonts w:ascii="Times New Roman" w:cs="Times New Roman" w:eastAsia="Times New Roman" w:hAnsi="Times New Roman"/>
+                <w:b w:val="false"/>
+                <w:bCs w:val="false"/>
+                <w:sz w:val="24"/>
+                <w:szCs w:val="24"/>
+              </w:rPr>
+              <w:t xml:space="preserve">16:45</w:t>
+            </w:r>
+          </w:p>
+        </w:tc>
+        <w:tc>
+          <w:tcPr>
+            <w:tcW w:type="dxa" w:w="1120"/>
+            <w:tcMar>
+              <w:top w:type="dxa" w:w="80"/>
+              <w:left w:type="dxa" w:w="120"/>
+              <w:bottom w:type="dxa" w:w="80"/>
+              <w:right w:type="dxa" w:w="120"/>
+            </w:tcMar>
+          </w:tcPr>
+          <w:p>
+            <w:pPr>
+              <w:spacing w:after="0"/>
+            </w:pPr>
+            <w:r>
+              <w:rPr>
+                <w:rFonts w:ascii="Times New Roman" w:cs="Times New Roman" w:eastAsia="Times New Roman" w:hAnsi="Times New Roman"/>
+                <w:b w:val="false"/>
+                <w:bCs w:val="false"/>
+                <w:sz w:val="24"/>
+                <w:szCs w:val="24"/>
+              </w:rPr>
+              <w:t xml:space="preserve">0:05</w:t>
+            </w:r>
+          </w:p>
+        </w:tc>
+        <w:tc>
+          <w:tcPr>
+            <w:tcW w:type="dxa" w:w="900"/>
+            <w:tcMar>
+              <w:top w:type="dxa" w:w="80"/>
+              <w:left w:type="dxa" w:w="120"/>
+              <w:bottom w:type="dxa" w:w="80"/>
+              <w:right w:type="dxa" w:w="120"/>
+            </w:tcMar>
+          </w:tcPr>
+          <w:p>
+            <w:pPr>
+              <w:spacing w:after="0"/>
+            </w:pPr>
+            <w:r>
+              <w:rPr>
+                <w:rFonts w:ascii="Times New Roman" w:cs="Times New Roman" w:eastAsia="Times New Roman" w:hAnsi="Times New Roman"/>
+                <w:b w:val="false"/>
+                <w:bCs w:val="false"/>
+                <w:sz w:val="24"/>
+                <w:szCs w:val="24"/>
+              </w:rPr>
+              <w:t xml:space="preserve">0:50</w:t>
+            </w:r>
+          </w:p>
+        </w:tc>
+        <w:tc>
+          <w:tcPr>
+            <w:tcW w:type="dxa" w:w="1280"/>
+            <w:tcMar>
+              <w:top w:type="dxa" w:w="80"/>
+              <w:left w:type="dxa" w:w="120"/>
+              <w:bottom w:type="dxa" w:w="80"/>
+              <w:right w:type="dxa" w:w="120"/>
+            </w:tcMar>
+          </w:tcPr>
+          <w:p>
+            <w:pPr>
+              <w:spacing w:after="0"/>
+            </w:pPr>
+            <w:r>
+              <w:rPr>
+                <w:rFonts w:ascii="Times New Roman" w:cs="Times New Roman" w:eastAsia="Times New Roman" w:hAnsi="Times New Roman"/>
+                <w:b w:val="false"/>
+                <w:bCs w:val="false"/>
+                <w:sz w:val="24"/>
+                <w:szCs w:val="24"/>
+              </w:rPr>
+              <w:t xml:space="preserve">Diseño y codificación</w:t>
+            </w:r>
+          </w:p>
+        </w:tc>
+        <w:tc>
+          <w:tcPr>
+            <w:tcW w:type="dxa" w:w="3800"/>
+            <w:tcMar>
+              <w:top w:type="dxa" w:w="80"/>
+              <w:left w:type="dxa" w:w="120"/>
+              <w:bottom w:type="dxa" w:w="80"/>
+              <w:right w:type="dxa" w:w="120"/>
+            </w:tcMar>
+          </w:tcPr>
+          <w:p>
+            <w:pPr>
+              <w:spacing w:after="0"/>
+            </w:pPr>
+            <w:r>
+              <w:rPr>
+                <w:rFonts w:ascii="Times New Roman" w:cs="Times New Roman" w:eastAsia="Times New Roman" w:hAnsi="Times New Roman"/>
+                <w:b w:val="false"/>
+                <w:bCs w:val="false"/>
+                <w:sz w:val="24"/>
+                <w:szCs w:val="24"/>
+              </w:rPr>
+              <w:t xml:space="preserve">AEUVG-135 Enlace a la ficha pública desde el panel. AEUVG-137 Total de eventos guardados en el perfil.</w:t>
+            </w:r>
+          </w:p>
+        </w:tc>
+      </w:tr>
     </w:tbl>
     <w:p>
       <w:pPr>
@@ -9278,7 +9646,7 @@
                 <w:sz w:val="24"/>
                 <w:szCs w:val="24"/>
               </w:rPr>
-              <w:t xml:space="preserve">2.5</w:t>
+              <w:t xml:space="preserve">2.4</w:t>
             </w:r>
           </w:p>
         </w:tc>
@@ -9652,7 +10020,7 @@
                 <w:sz w:val="24"/>
                 <w:szCs w:val="24"/>
               </w:rPr>
-              <w:t xml:space="preserve">0:55</w:t>
+              <w:t xml:space="preserve">1:45</w:t>
             </w:r>
           </w:p>
         </w:tc>
@@ -9678,7 +10046,7 @@
                 <w:sz w:val="24"/>
                 <w:szCs w:val="24"/>
               </w:rPr>
-              <w:t xml:space="preserve">0.9</w:t>
+              <w:t xml:space="preserve">1.8</w:t>
             </w:r>
           </w:p>
         </w:tc>
@@ -9732,7 +10100,7 @@
                 <w:sz w:val="24"/>
                 <w:szCs w:val="24"/>
               </w:rPr>
-              <w:t xml:space="preserve">10:10</w:t>
+              <w:t xml:space="preserve">11:00</w:t>
             </w:r>
           </w:p>
         </w:tc>
@@ -9758,7 +10126,7 @@
                 <w:sz w:val="24"/>
                 <w:szCs w:val="24"/>
               </w:rPr>
-              <w:t xml:space="preserve">10.2</w:t>
+              <w:t xml:space="preserve">11.0</w:t>
             </w:r>
           </w:p>
         </w:tc>
@@ -9966,7 +10334,7 @@
                 <w:sz w:val="24"/>
                 <w:szCs w:val="24"/>
               </w:rPr>
-              <w:t xml:space="preserve">17</w:t>
+              <w:t xml:space="preserve">18</w:t>
             </w:r>
           </w:p>
         </w:tc>
@@ -9992,7 +10360,7 @@
                 <w:sz w:val="24"/>
                 <w:szCs w:val="24"/>
               </w:rPr>
-              <w:t xml:space="preserve">16:15</w:t>
+              <w:t xml:space="preserve">17:30</w:t>
             </w:r>
           </w:p>
         </w:tc>
@@ -10018,7 +10386,7 @@
                 <w:sz w:val="24"/>
                 <w:szCs w:val="24"/>
               </w:rPr>
-              <w:t xml:space="preserve">16.3</w:t>
+              <w:t xml:space="preserve">17.5</w:t>
             </w:r>
           </w:p>
         </w:tc>
@@ -10072,7 +10440,7 @@
                 <w:sz w:val="24"/>
                 <w:szCs w:val="24"/>
               </w:rPr>
-              <w:t xml:space="preserve">12</w:t>
+              <w:t xml:space="preserve">13</w:t>
             </w:r>
           </w:p>
         </w:tc>
@@ -10098,7 +10466,7 @@
                 <w:sz w:val="24"/>
                 <w:szCs w:val="24"/>
               </w:rPr>
-              <w:t xml:space="preserve">10:10</w:t>
+              <w:t xml:space="preserve">11:00</w:t>
             </w:r>
           </w:p>
         </w:tc>
@@ -10124,7 +10492,7 @@
                 <w:sz w:val="24"/>
                 <w:szCs w:val="24"/>
               </w:rPr>
-              <w:t xml:space="preserve">10.2</w:t>
+              <w:t xml:space="preserve">11.0</w:t>
             </w:r>
           </w:p>
         </w:tc>
@@ -10178,7 +10546,7 @@
                 <w:sz w:val="24"/>
                 <w:szCs w:val="24"/>
               </w:rPr>
-              <w:t xml:space="preserve">29</w:t>
+              <w:t xml:space="preserve">31</w:t>
             </w:r>
           </w:p>
         </w:tc>
@@ -10204,7 +10572,7 @@
                 <w:sz w:val="24"/>
                 <w:szCs w:val="24"/>
               </w:rPr>
-              <w:t xml:space="preserve">26:25</w:t>
+              <w:t xml:space="preserve">28:30</w:t>
             </w:r>
           </w:p>
         </w:tc>
@@ -10230,7 +10598,7 @@
                 <w:sz w:val="24"/>
                 <w:szCs w:val="24"/>
               </w:rPr>
-              <w:t xml:space="preserve">26.4</w:t>
+              <w:t xml:space="preserve">28.5</w:t>
             </w:r>
           </w:p>
         </w:tc>

</xml_diff>

<commit_message>
Registrar en el documento del Sprint 3 la correccion del texto de busqueda
</commit_message>
<xml_diff>
--- a/Documentos/AEUVG - Desarrollo Sprint 3.docx
+++ b/Documentos/AEUVG - Desarrollo Sprint 3.docx
@@ -1361,7 +1361,7 @@
           <w:sz w:val="24"/>
           <w:szCs w:val="24"/>
         </w:rPr>
-        <w:t xml:space="preserve">Las pruebas automatizadas del proyecto pasaron de 147 a 223. Las 76 nuevas corresponden a este sprint y se ejecutan sin base de datos, sustituyendo el acceso a datos por dobles de prueba, para que puedan correrse en cualquier momento del desarrollo.</w:t>
+        <w:t xml:space="preserve">Las pruebas automatizadas del proyecto pasaron de 147 a 225. Las 78 nuevas corresponden a este sprint y se ejecutan sin base de datos, sustituyendo el acceso a datos por dobles de prueba, para que puedan correrse en cualquier momento del desarrollo.</w:t>
       </w:r>
     </w:p>
     <w:p>
@@ -1872,6 +1872,86 @@
           </w:p>
         </w:tc>
       </w:tr>
+      <w:tr>
+        <w:tc>
+          <w:tcPr>
+            <w:tcW w:type="dxa" w:w="3400"/>
+            <w:tcMar>
+              <w:top w:type="dxa" w:w="80"/>
+              <w:left w:type="dxa" w:w="120"/>
+              <w:bottom w:type="dxa" w:w="80"/>
+              <w:right w:type="dxa" w:w="120"/>
+            </w:tcMar>
+          </w:tcPr>
+          <w:p>
+            <w:pPr>
+              <w:spacing w:after="0"/>
+            </w:pPr>
+            <w:r>
+              <w:rPr>
+                <w:rFonts w:ascii="Times New Roman" w:cs="Times New Roman" w:eastAsia="Times New Roman" w:hAnsi="Times New Roman"/>
+                <w:b w:val="false"/>
+                <w:bCs w:val="false"/>
+                <w:sz w:val="24"/>
+                <w:szCs w:val="24"/>
+              </w:rPr>
+              <w:t xml:space="preserve">Migraciones de búsqueda</w:t>
+            </w:r>
+          </w:p>
+        </w:tc>
+        <w:tc>
+          <w:tcPr>
+            <w:tcW w:type="dxa" w:w="1400"/>
+            <w:tcMar>
+              <w:top w:type="dxa" w:w="80"/>
+              <w:left w:type="dxa" w:w="120"/>
+              <w:bottom w:type="dxa" w:w="80"/>
+              <w:right w:type="dxa" w:w="120"/>
+            </w:tcMar>
+          </w:tcPr>
+          <w:p>
+            <w:pPr>
+              <w:spacing w:after="0"/>
+            </w:pPr>
+            <w:r>
+              <w:rPr>
+                <w:rFonts w:ascii="Times New Roman" w:cs="Times New Roman" w:eastAsia="Times New Roman" w:hAnsi="Times New Roman"/>
+                <w:b w:val="false"/>
+                <w:bCs w:val="false"/>
+                <w:sz w:val="24"/>
+                <w:szCs w:val="24"/>
+              </w:rPr>
+              <w:t xml:space="preserve">2</w:t>
+            </w:r>
+          </w:p>
+        </w:tc>
+        <w:tc>
+          <w:tcPr>
+            <w:tcW w:type="dxa" w:w="4560"/>
+            <w:tcMar>
+              <w:top w:type="dxa" w:w="80"/>
+              <w:left w:type="dxa" w:w="120"/>
+              <w:bottom w:type="dxa" w:w="80"/>
+              <w:right w:type="dxa" w:w="120"/>
+            </w:tcMar>
+          </w:tcPr>
+          <w:p>
+            <w:pPr>
+              <w:spacing w:after="0"/>
+            </w:pPr>
+            <w:r>
+              <w:rPr>
+                <w:rFonts w:ascii="Times New Roman" w:cs="Times New Roman" w:eastAsia="Times New Roman" w:hAnsi="Times New Roman"/>
+                <w:b w:val="false"/>
+                <w:bCs w:val="false"/>
+                <w:sz w:val="24"/>
+                <w:szCs w:val="24"/>
+              </w:rPr>
+              <w:t xml:space="preserve">Que ninguna migración nueva desalinee los juegos de caracteres de su translate() y que el último mapeo coincida con el de la aplicación.</w:t>
+            </w:r>
+          </w:p>
+        </w:tc>
+      </w:tr>
     </w:tbl>
     <w:p>
       <w:pPr>
@@ -1890,6 +1970,34 @@
           <w:szCs w:val="24"/>
         </w:rPr>
         <w:t xml:space="preserve">Las pruebas del módulo de eventos se actualizaron al nuevo formato de los organizadores, que ahora incluye el enlace de cada uno. Además de las pruebas automatizadas se verificó que el proyecto compile sin errores de tipos, que el análisis estático no reporte problemas y que la compilación de producción se complete, incluyendo las trece rutas nuevas del sprint. Las pantallas se revisaron en anchos de teléfono, tableta y escritorio.</w:t>
+      </w:r>
+    </w:p>
+    <w:p>
+      <w:pPr>
+        <w:spacing w:after="160" w:line="300"/>
+        <w:jc w:val="both"/>
+      </w:pPr>
+      <w:r>
+        <w:rPr>
+          <w:rFonts w:ascii="Times New Roman" w:cs="Times New Roman" w:eastAsia="Times New Roman" w:hAnsi="Times New Roman"/>
+          <w:sz w:val="24"/>
+          <w:szCs w:val="24"/>
+        </w:rPr>
+        <w:t xml:space="preserve">La migración del sprint se aplicó en Railway al cierre y la verificación contra la base real dejó al descubierto un defecto heredado del Sprint 2. El translate() con el que las migraciones cargan por primera vez el texto de búsqueda tenía veinticuatro caracteres de entrada y solo veintidós de salida; PostgreSQL alinea los dos juegos por posición y descarta los que quedan sin pareja, así que a partir de la «ü» el reemplazo se desplazaba y la «ñ» terminaba convertida en «a». El efecto era que un registro cargado antes de la migración y nunca vuelto a guardar quedaba fuera del buscador para cualquier palabra con «ñ»: buscar «diseno» no encontraba «Diseño».</w:t>
+      </w:r>
+    </w:p>
+    <w:p>
+      <w:pPr>
+        <w:spacing w:after="160" w:line="300"/>
+        <w:jc w:val="both"/>
+      </w:pPr>
+      <w:r>
+        <w:rPr>
+          <w:rFonts w:ascii="Times New Roman" w:cs="Times New Roman" w:eastAsia="Times New Roman" w:hAnsi="Times New Roman"/>
+          <w:sz w:val="24"/>
+          <w:szCs w:val="24"/>
+        </w:rPr>
+        <w:t xml:space="preserve">La normalización de la aplicación, que es la que se ejecuta en cada creación y edición, siempre fue correcta, por lo que el problema solo alcanzaba a las filas previas a cada migración: de las seis filas afectadas en el ambiente, cinco eventos ya estaban correctos por haberse editado después y solo la ficha de AEUVG conservaba el valor mal calculado. Se corrigió con una migración que vuelve a calcular las tres columnas con el juego alineado, sin tocar las migraciones ya aplicadas, cuya suma de verificación Prisma conserva. La verificación posterior confirmó que ninguna fila difiere de lo que calcula la aplicación.</w:t>
       </w:r>
     </w:p>
     <w:p>
@@ -1920,7 +2028,7 @@
           <w:sz w:val="24"/>
           <w:szCs w:val="24"/>
         </w:rPr>
-        <w:t xml:space="preserve">Las seis historias comprometidas para el Sprint 3 se encuentran completadas, con 28.5 horas de trabajo de equipo frente a las 28 estimadas. El detalle por sesión se encuentra en la sección 10. La plataforma cuenta ahora con:</w:t>
+        <w:t xml:space="preserve">Las seis historias comprometidas para el Sprint 3 se encuentran completadas, con 29.0 horas de trabajo de equipo frente a las 28 estimadas. El detalle por sesión se encuentra en la sección 10. La plataforma cuenta ahora con:</w:t>
       </w:r>
     </w:p>
     <w:p>
@@ -2173,7 +2281,7 @@
           <w:sz w:val="24"/>
           <w:szCs w:val="24"/>
         </w:rPr>
-        <w:t xml:space="preserve">El sprint sumó 28.5 horas de equipo: 17.5 horas de Harry Méndez y 11.0 horas de Juan Gabriel Gualim, frente a las 28 horas estimadas en la planificación, es decir, un 2% por encima de lo previsto. La estimación se calculó con la velocidad medida en el Sprint 2 y este sprint reutilizó los componentes de listado, paginación, estado vacío y carga de imágenes construidos en aquel, lo que mantuvo el tiempo real cerca de lo previsto. La diferencia corresponde al día de cierre: la revisión con AEUVG dejó observaciones que se resolvieron el mismo 7 de octubre, antes de publicar la versión final del sprint.</w:t>
+        <w:t xml:space="preserve">El sprint sumó 29.0 horas de equipo: 18.0 horas de Harry Méndez y 11.0 horas de Juan Gabriel Gualim, frente a las 28 horas estimadas en la planificación, es decir, un 4% por encima de lo previsto. La estimación se calculó con la velocidad medida en el Sprint 2 y este sprint reutilizó los componentes de listado, paginación, estado vacío y carga de imágenes construidos en aquel, lo que mantuvo el tiempo real cerca de lo previsto. La diferencia corresponde al día de cierre: la revisión con AEUVG dejó observaciones que se resolvieron el mismo 7 de octubre, antes de publicar la versión final del sprint.</w:t>
       </w:r>
     </w:p>
     <w:p>
@@ -5725,6 +5833,190 @@
           </w:p>
         </w:tc>
       </w:tr>
+      <w:tr>
+        <w:tc>
+          <w:tcPr>
+            <w:tcW w:type="dxa" w:w="900"/>
+            <w:tcMar>
+              <w:top w:type="dxa" w:w="80"/>
+              <w:left w:type="dxa" w:w="120"/>
+              <w:bottom w:type="dxa" w:w="80"/>
+              <w:right w:type="dxa" w:w="120"/>
+            </w:tcMar>
+          </w:tcPr>
+          <w:p>
+            <w:pPr>
+              <w:spacing w:after="0"/>
+            </w:pPr>
+            <w:r>
+              <w:rPr>
+                <w:rFonts w:ascii="Times New Roman" w:cs="Times New Roman" w:eastAsia="Times New Roman" w:hAnsi="Times New Roman"/>
+                <w:b w:val="false"/>
+                <w:bCs w:val="false"/>
+                <w:sz w:val="24"/>
+                <w:szCs w:val="24"/>
+              </w:rPr>
+              <w:t xml:space="preserve">07/10/2026</w:t>
+            </w:r>
+          </w:p>
+        </w:tc>
+        <w:tc>
+          <w:tcPr>
+            <w:tcW w:type="dxa" w:w="680"/>
+            <w:tcMar>
+              <w:top w:type="dxa" w:w="80"/>
+              <w:left w:type="dxa" w:w="120"/>
+              <w:bottom w:type="dxa" w:w="80"/>
+              <w:right w:type="dxa" w:w="120"/>
+            </w:tcMar>
+          </w:tcPr>
+          <w:p>
+            <w:pPr>
+              <w:spacing w:after="0"/>
+            </w:pPr>
+            <w:r>
+              <w:rPr>
+                <w:rFonts w:ascii="Times New Roman" w:cs="Times New Roman" w:eastAsia="Times New Roman" w:hAnsi="Times New Roman"/>
+                <w:b w:val="false"/>
+                <w:bCs w:val="false"/>
+                <w:sz w:val="24"/>
+                <w:szCs w:val="24"/>
+              </w:rPr>
+              <w:t xml:space="preserve">18:00</w:t>
+            </w:r>
+          </w:p>
+        </w:tc>
+        <w:tc>
+          <w:tcPr>
+            <w:tcW w:type="dxa" w:w="680"/>
+            <w:tcMar>
+              <w:top w:type="dxa" w:w="80"/>
+              <w:left w:type="dxa" w:w="120"/>
+              <w:bottom w:type="dxa" w:w="80"/>
+              <w:right w:type="dxa" w:w="120"/>
+            </w:tcMar>
+          </w:tcPr>
+          <w:p>
+            <w:pPr>
+              <w:spacing w:after="0"/>
+            </w:pPr>
+            <w:r>
+              <w:rPr>
+                <w:rFonts w:ascii="Times New Roman" w:cs="Times New Roman" w:eastAsia="Times New Roman" w:hAnsi="Times New Roman"/>
+                <w:b w:val="false"/>
+                <w:bCs w:val="false"/>
+                <w:sz w:val="24"/>
+                <w:szCs w:val="24"/>
+              </w:rPr>
+              <w:t xml:space="preserve">18:35</w:t>
+            </w:r>
+          </w:p>
+        </w:tc>
+        <w:tc>
+          <w:tcPr>
+            <w:tcW w:type="dxa" w:w="1120"/>
+            <w:tcMar>
+              <w:top w:type="dxa" w:w="80"/>
+              <w:left w:type="dxa" w:w="120"/>
+              <w:bottom w:type="dxa" w:w="80"/>
+              <w:right w:type="dxa" w:w="120"/>
+            </w:tcMar>
+          </w:tcPr>
+          <w:p>
+            <w:pPr>
+              <w:spacing w:after="0"/>
+            </w:pPr>
+            <w:r>
+              <w:rPr>
+                <w:rFonts w:ascii="Times New Roman" w:cs="Times New Roman" w:eastAsia="Times New Roman" w:hAnsi="Times New Roman"/>
+                <w:b w:val="false"/>
+                <w:bCs w:val="false"/>
+                <w:sz w:val="24"/>
+                <w:szCs w:val="24"/>
+              </w:rPr>
+              <w:t xml:space="preserve">0:05</w:t>
+            </w:r>
+          </w:p>
+        </w:tc>
+        <w:tc>
+          <w:tcPr>
+            <w:tcW w:type="dxa" w:w="900"/>
+            <w:tcMar>
+              <w:top w:type="dxa" w:w="80"/>
+              <w:left w:type="dxa" w:w="120"/>
+              <w:bottom w:type="dxa" w:w="80"/>
+              <w:right w:type="dxa" w:w="120"/>
+            </w:tcMar>
+          </w:tcPr>
+          <w:p>
+            <w:pPr>
+              <w:spacing w:after="0"/>
+            </w:pPr>
+            <w:r>
+              <w:rPr>
+                <w:rFonts w:ascii="Times New Roman" w:cs="Times New Roman" w:eastAsia="Times New Roman" w:hAnsi="Times New Roman"/>
+                <w:b w:val="false"/>
+                <w:bCs w:val="false"/>
+                <w:sz w:val="24"/>
+                <w:szCs w:val="24"/>
+              </w:rPr>
+              <w:t xml:space="preserve">0:30</w:t>
+            </w:r>
+          </w:p>
+        </w:tc>
+        <w:tc>
+          <w:tcPr>
+            <w:tcW w:type="dxa" w:w="1280"/>
+            <w:tcMar>
+              <w:top w:type="dxa" w:w="80"/>
+              <w:left w:type="dxa" w:w="120"/>
+              <w:bottom w:type="dxa" w:w="80"/>
+              <w:right w:type="dxa" w:w="120"/>
+            </w:tcMar>
+          </w:tcPr>
+          <w:p>
+            <w:pPr>
+              <w:spacing w:after="0"/>
+            </w:pPr>
+            <w:r>
+              <w:rPr>
+                <w:rFonts w:ascii="Times New Roman" w:cs="Times New Roman" w:eastAsia="Times New Roman" w:hAnsi="Times New Roman"/>
+                <w:b w:val="false"/>
+                <w:bCs w:val="false"/>
+                <w:sz w:val="24"/>
+                <w:szCs w:val="24"/>
+              </w:rPr>
+              <w:t xml:space="preserve">Codificación y pruebas</w:t>
+            </w:r>
+          </w:p>
+        </w:tc>
+        <w:tc>
+          <w:tcPr>
+            <w:tcW w:type="dxa" w:w="3800"/>
+            <w:tcMar>
+              <w:top w:type="dxa" w:w="80"/>
+              <w:left w:type="dxa" w:w="120"/>
+              <w:bottom w:type="dxa" w:w="80"/>
+              <w:right w:type="dxa" w:w="120"/>
+            </w:tcMar>
+          </w:tcPr>
+          <w:p>
+            <w:pPr>
+              <w:spacing w:after="0"/>
+            </w:pPr>
+            <w:r>
+              <w:rPr>
+                <w:rFonts w:ascii="Times New Roman" w:cs="Times New Roman" w:eastAsia="Times New Roman" w:hAnsi="Times New Roman"/>
+                <w:b w:val="false"/>
+                <w:bCs w:val="false"/>
+                <w:sz w:val="24"/>
+                <w:szCs w:val="24"/>
+              </w:rPr>
+              <w:t xml:space="preserve">AEUVG-139 Corrección de la carga inicial del texto de búsqueda al aplicar las migraciones en Railway, con su prueba de regresión.</w:t>
+            </w:r>
+          </w:p>
+        </w:tc>
+      </w:tr>
     </w:tbl>
     <w:p>
       <w:pPr>
@@ -6462,7 +6754,7 @@
                 <w:sz w:val="24"/>
                 <w:szCs w:val="24"/>
               </w:rPr>
-              <w:t xml:space="preserve">2:10</w:t>
+              <w:t xml:space="preserve">2:40</w:t>
             </w:r>
           </w:p>
         </w:tc>
@@ -6488,7 +6780,7 @@
                 <w:sz w:val="24"/>
                 <w:szCs w:val="24"/>
               </w:rPr>
-              <w:t xml:space="preserve">2.2</w:t>
+              <w:t xml:space="preserve">2.7</w:t>
             </w:r>
           </w:p>
         </w:tc>
@@ -6622,7 +6914,7 @@
                 <w:sz w:val="24"/>
                 <w:szCs w:val="24"/>
               </w:rPr>
-              <w:t xml:space="preserve">17:30</w:t>
+              <w:t xml:space="preserve">18:00</w:t>
             </w:r>
           </w:p>
         </w:tc>
@@ -6648,7 +6940,7 @@
                 <w:sz w:val="24"/>
                 <w:szCs w:val="24"/>
               </w:rPr>
-              <w:t xml:space="preserve">17.5</w:t>
+              <w:t xml:space="preserve">18.0</w:t>
             </w:r>
           </w:p>
         </w:tc>
@@ -10334,7 +10626,7 @@
                 <w:sz w:val="24"/>
                 <w:szCs w:val="24"/>
               </w:rPr>
-              <w:t xml:space="preserve">18</w:t>
+              <w:t xml:space="preserve">19</w:t>
             </w:r>
           </w:p>
         </w:tc>
@@ -10360,7 +10652,7 @@
                 <w:sz w:val="24"/>
                 <w:szCs w:val="24"/>
               </w:rPr>
-              <w:t xml:space="preserve">17:30</w:t>
+              <w:t xml:space="preserve">18:00</w:t>
             </w:r>
           </w:p>
         </w:tc>
@@ -10386,7 +10678,7 @@
                 <w:sz w:val="24"/>
                 <w:szCs w:val="24"/>
               </w:rPr>
-              <w:t xml:space="preserve">17.5</w:t>
+              <w:t xml:space="preserve">18.0</w:t>
             </w:r>
           </w:p>
         </w:tc>
@@ -10546,7 +10838,7 @@
                 <w:sz w:val="24"/>
                 <w:szCs w:val="24"/>
               </w:rPr>
-              <w:t xml:space="preserve">31</w:t>
+              <w:t xml:space="preserve">32</w:t>
             </w:r>
           </w:p>
         </w:tc>
@@ -10572,7 +10864,7 @@
                 <w:sz w:val="24"/>
                 <w:szCs w:val="24"/>
               </w:rPr>
-              <w:t xml:space="preserve">28:30</w:t>
+              <w:t xml:space="preserve">29:00</w:t>
             </w:r>
           </w:p>
         </w:tc>
@@ -10598,7 +10890,7 @@
                 <w:sz w:val="24"/>
                 <w:szCs w:val="24"/>
               </w:rPr>
-              <w:t xml:space="preserve">28.5</w:t>
+              <w:t xml:space="preserve">29.0</w:t>
             </w:r>
           </w:p>
         </w:tc>

</xml_diff>

<commit_message>
Registrar en el documento del Sprint 3 los ajustes finales y sus tiempos
Agrega la seccion de ajustes finales (campos obligatorios, siglas de las
asociaciones, tarjetas, portada con carrusel, navegacion del panel,
contenido de demostracion y publicacion en produccion), actualiza las
pruebas a 236 y el estado del sprint, e incorpora al registro de tiempos
las sesiones del 7 al 10 de octubre de ambos integrantes.
</commit_message>
<xml_diff>
--- a/Documentos/AEUVG - Desarrollo Sprint 3.docx
+++ b/Documentos/AEUVG - Desarrollo Sprint 3.docx
@@ -95,7 +95,7 @@
           <w:sz w:val="24"/>
           <w:szCs w:val="24"/>
         </w:rPr>
-        <w:t xml:space="preserve">Guatemala, 7 de octubre del 2026</w:t>
+        <w:t xml:space="preserve">Guatemala, 10 de octubre del 2026</w:t>
       </w:r>
     </w:p>
     <w:p>
@@ -1361,7 +1361,7 @@
           <w:sz w:val="24"/>
           <w:szCs w:val="24"/>
         </w:rPr>
-        <w:t xml:space="preserve">Las pruebas automatizadas del proyecto pasaron de 147 a 225. Las 78 nuevas corresponden a este sprint y se ejecutan sin base de datos, sustituyendo el acceso a datos por dobles de prueba, para que puedan correrse en cualquier momento del desarrollo.</w:t>
+        <w:t xml:space="preserve">Las pruebas automatizadas del proyecto pasaron de 147 a 236. Las 89 nuevas corresponden a este sprint, incluidas las de los ajustes finales de la sección 9, y se ejecutan sin base de datos, sustituyendo el acceso a datos por dobles de prueba, para que puedan correrse en cualquier momento del desarrollo.</w:t>
       </w:r>
     </w:p>
     <w:p>
@@ -1952,6 +1952,166 @@
           </w:p>
         </w:tc>
       </w:tr>
+      <w:tr>
+        <w:tc>
+          <w:tcPr>
+            <w:tcW w:type="dxa" w:w="3400"/>
+            <w:tcMar>
+              <w:top w:type="dxa" w:w="80"/>
+              <w:left w:type="dxa" w:w="120"/>
+              <w:bottom w:type="dxa" w:w="80"/>
+              <w:right w:type="dxa" w:w="120"/>
+            </w:tcMar>
+          </w:tcPr>
+          <w:p>
+            <w:pPr>
+              <w:spacing w:after="0"/>
+            </w:pPr>
+            <w:r>
+              <w:rPr>
+                <w:rFonts w:ascii="Times New Roman" w:cs="Times New Roman" w:eastAsia="Times New Roman" w:hAnsi="Times New Roman"/>
+                <w:b w:val="false"/>
+                <w:bCs w:val="false"/>
+                <w:sz w:val="24"/>
+                <w:szCs w:val="24"/>
+              </w:rPr>
+              <w:t xml:space="preserve">Siglas de las asociaciones</w:t>
+            </w:r>
+          </w:p>
+        </w:tc>
+        <w:tc>
+          <w:tcPr>
+            <w:tcW w:type="dxa" w:w="1400"/>
+            <w:tcMar>
+              <w:top w:type="dxa" w:w="80"/>
+              <w:left w:type="dxa" w:w="120"/>
+              <w:bottom w:type="dxa" w:w="80"/>
+              <w:right w:type="dxa" w:w="120"/>
+            </w:tcMar>
+          </w:tcPr>
+          <w:p>
+            <w:pPr>
+              <w:spacing w:after="0"/>
+            </w:pPr>
+            <w:r>
+              <w:rPr>
+                <w:rFonts w:ascii="Times New Roman" w:cs="Times New Roman" w:eastAsia="Times New Roman" w:hAnsi="Times New Roman"/>
+                <w:b w:val="false"/>
+                <w:bCs w:val="false"/>
+                <w:sz w:val="24"/>
+                <w:szCs w:val="24"/>
+              </w:rPr>
+              <w:t xml:space="preserve">6</w:t>
+            </w:r>
+          </w:p>
+        </w:tc>
+        <w:tc>
+          <w:tcPr>
+            <w:tcW w:type="dxa" w:w="4560"/>
+            <w:tcMar>
+              <w:top w:type="dxa" w:w="80"/>
+              <w:left w:type="dxa" w:w="120"/>
+              <w:bottom w:type="dxa" w:w="80"/>
+              <w:right w:type="dxa" w:w="120"/>
+            </w:tcMar>
+          </w:tcPr>
+          <w:p>
+            <w:pPr>
+              <w:spacing w:after="0"/>
+            </w:pPr>
+            <w:r>
+              <w:rPr>
+                <w:rFonts w:ascii="Times New Roman" w:cs="Times New Roman" w:eastAsia="Times New Roman" w:hAnsi="Times New Roman"/>
+                <w:b w:val="false"/>
+                <w:bCs w:val="false"/>
+                <w:sz w:val="24"/>
+                <w:szCs w:val="24"/>
+              </w:rPr>
+              <w:t xml:space="preserve">Su validación, que sean opcionales, que no se repitan sin distinguir mayúsculas, que al editar no choquen con las propias y que formen parte del texto de búsqueda.</w:t>
+            </w:r>
+          </w:p>
+        </w:tc>
+      </w:tr>
+      <w:tr>
+        <w:tc>
+          <w:tcPr>
+            <w:tcW w:type="dxa" w:w="3400"/>
+            <w:tcMar>
+              <w:top w:type="dxa" w:w="80"/>
+              <w:left w:type="dxa" w:w="120"/>
+              <w:bottom w:type="dxa" w:w="80"/>
+              <w:right w:type="dxa" w:w="120"/>
+            </w:tcMar>
+          </w:tcPr>
+          <w:p>
+            <w:pPr>
+              <w:spacing w:after="0"/>
+            </w:pPr>
+            <w:r>
+              <w:rPr>
+                <w:rFonts w:ascii="Times New Roman" w:cs="Times New Roman" w:eastAsia="Times New Roman" w:hAnsi="Times New Roman"/>
+                <w:b w:val="false"/>
+                <w:bCs w:val="false"/>
+                <w:sz w:val="24"/>
+                <w:szCs w:val="24"/>
+              </w:rPr>
+              <w:t xml:space="preserve">Carrusel de la portada</w:t>
+            </w:r>
+          </w:p>
+        </w:tc>
+        <w:tc>
+          <w:tcPr>
+            <w:tcW w:type="dxa" w:w="1400"/>
+            <w:tcMar>
+              <w:top w:type="dxa" w:w="80"/>
+              <w:left w:type="dxa" w:w="120"/>
+              <w:bottom w:type="dxa" w:w="80"/>
+              <w:right w:type="dxa" w:w="120"/>
+            </w:tcMar>
+          </w:tcPr>
+          <w:p>
+            <w:pPr>
+              <w:spacing w:after="0"/>
+            </w:pPr>
+            <w:r>
+              <w:rPr>
+                <w:rFonts w:ascii="Times New Roman" w:cs="Times New Roman" w:eastAsia="Times New Roman" w:hAnsi="Times New Roman"/>
+                <w:b w:val="false"/>
+                <w:bCs w:val="false"/>
+                <w:sz w:val="24"/>
+                <w:szCs w:val="24"/>
+              </w:rPr>
+              <w:t xml:space="preserve">5</w:t>
+            </w:r>
+          </w:p>
+        </w:tc>
+        <w:tc>
+          <w:tcPr>
+            <w:tcW w:type="dxa" w:w="4560"/>
+            <w:tcMar>
+              <w:top w:type="dxa" w:w="80"/>
+              <w:left w:type="dxa" w:w="120"/>
+              <w:bottom w:type="dxa" w:w="80"/>
+              <w:right w:type="dxa" w:w="120"/>
+            </w:tcMar>
+          </w:tcPr>
+          <w:p>
+            <w:pPr>
+              <w:spacing w:after="0"/>
+            </w:pPr>
+            <w:r>
+              <w:rPr>
+                <w:rFonts w:ascii="Times New Roman" w:cs="Times New Roman" w:eastAsia="Times New Roman" w:hAnsi="Times New Roman"/>
+                <w:b w:val="false"/>
+                <w:bCs w:val="false"/>
+                <w:sz w:val="24"/>
+                <w:szCs w:val="24"/>
+              </w:rPr>
+              <w:t xml:space="preserve">La prioridad de los destacados, que un evento no se repita, el orden por fecha y las partes de la fecha en la hora de Guatemala.</w:t>
+            </w:r>
+          </w:p>
+        </w:tc>
+      </w:tr>
     </w:tbl>
     <w:p>
       <w:pPr>
@@ -2014,7 +2174,7 @@
           <w:sz w:val="34"/>
           <w:szCs w:val="34"/>
         </w:rPr>
-        <w:t xml:space="preserve">9. Estado del sprint</w:t>
+        <w:t xml:space="preserve">9. Ajustes finales del sprint</w:t>
       </w:r>
     </w:p>
     <w:p>
@@ -2028,7 +2188,353 @@
           <w:sz w:val="24"/>
           <w:szCs w:val="24"/>
         </w:rPr>
-        <w:t xml:space="preserve">Las seis historias comprometidas para el Sprint 3 se encuentran completadas, con 29.0 horas de trabajo de equipo frente a las 28 estimadas. El detalle por sesión se encuentra en la sección 10. La plataforma cuenta ahora con:</w:t>
+        <w:t xml:space="preserve">Después de la revisión del 7 de octubre se acordó un segundo grupo de ajustes antes de dar por cerrado el sprint. Se desarrollaron entre el 7 y el 10 de octubre sin abrir historias nuevas: mejoran lo entregado y preparan la plataforma para presentarse a AEUVG con contenido.</w:t>
+      </w:r>
+    </w:p>
+    <w:p>
+      <w:pPr>
+        <w:pStyle w:val="Heading2"/>
+        <w:spacing w:after="160" w:before="280"/>
+      </w:pPr>
+      <w:r>
+        <w:rPr>
+          <w:rFonts w:ascii="Times New Roman" w:cs="Times New Roman" w:eastAsia="Times New Roman" w:hAnsi="Times New Roman"/>
+          <w:b/>
+          <w:bCs/>
+          <w:color w:val="000000"/>
+          <w:sz w:val="30"/>
+          <w:szCs w:val="30"/>
+        </w:rPr>
+        <w:t xml:space="preserve">9.1. Campos obligatorios</w:t>
+      </w:r>
+    </w:p>
+    <w:p>
+      <w:pPr>
+        <w:spacing w:after="160" w:line="300"/>
+        <w:jc w:val="both"/>
+      </w:pPr>
+      <w:r>
+        <w:rPr>
+          <w:rFonts w:ascii="Times New Roman" w:cs="Times New Roman" w:eastAsia="Times New Roman" w:hAnsi="Times New Roman"/>
+          <w:sz w:val="24"/>
+          <w:szCs w:val="24"/>
+        </w:rPr>
+        <w:t xml:space="preserve">Todos los formularios del sitio marcan sus campos obligatorios con un asterisco rojo junto a la etiqueta, que es la convención que el estudiantado ya conoce de otros sitios. Abarca el registro, el inicio de sesión, la recuperación y el restablecimiento de la contraseña, el perfil, los eventos, las asociaciones y clubes, la junta directiva y las redes sociales. Los formularios con más de un campo abren con una nota que explica el asterisco, y en el inicio de sesión el asterisco sustituyó la etiqueta lateral que decía “Requerido”.</w:t>
+      </w:r>
+    </w:p>
+    <w:p>
+      <w:pPr>
+        <w:spacing w:after="160" w:line="300"/>
+        <w:jc w:val="both"/>
+      </w:pPr>
+      <w:r>
+        <w:rPr>
+          <w:rFonts w:ascii="Times New Roman" w:cs="Times New Roman" w:eastAsia="Times New Roman" w:hAnsi="Times New Roman"/>
+          <w:sz w:val="24"/>
+          <w:szCs w:val="24"/>
+        </w:rPr>
+        <w:t xml:space="preserve">Se resolvió con un componente de etiqueta compartido, que además usan los campos base del sistema de diseño: basta con marcar el control como requerido para que su etiqueta muestre el asterisco, de modo que un formulario nuevo no pueda olvidarlo. El asterisco se oculta a los lectores de pantalla, que ya anuncian el campo como requerido por el propio control; leer además “asterisco” solo añadiría ruido. Los formularios conservan la validación propia del esquema, con sus mensajes en español, en lugar de la del navegador.</w:t>
+      </w:r>
+    </w:p>
+    <w:p>
+      <w:pPr>
+        <w:pStyle w:val="Heading2"/>
+        <w:spacing w:after="160" w:before="280"/>
+      </w:pPr>
+      <w:r>
+        <w:rPr>
+          <w:rFonts w:ascii="Times New Roman" w:cs="Times New Roman" w:eastAsia="Times New Roman" w:hAnsi="Times New Roman"/>
+          <w:b/>
+          <w:bCs/>
+          <w:color w:val="000000"/>
+          <w:sz w:val="30"/>
+          <w:szCs w:val="30"/>
+        </w:rPr>
+        <w:t xml:space="preserve">9.2. Siglas de las asociaciones</w:t>
+      </w:r>
+    </w:p>
+    <w:p>
+      <w:pPr>
+        <w:spacing w:after="160" w:line="300"/>
+        <w:jc w:val="both"/>
+      </w:pPr>
+      <w:r>
+        <w:rPr>
+          <w:rFonts w:ascii="Times New Roman" w:cs="Times New Roman" w:eastAsia="Times New Roman" w:hAnsi="Times New Roman"/>
+          <w:sz w:val="24"/>
+          <w:szCs w:val="24"/>
+        </w:rPr>
+        <w:t xml:space="preserve">Las asociaciones se conocen por sus siglas más que por su nombre completo: casi nadie dice “Asociación de Estudiantes en Ciencias de la Computación y Tecnologías de la Información”, sino AECCTIUVG. La ficha registra ahora las dos formas. Las siglas se agregaron con una migración nueva como una columna opcional, porque no todas las asociaciones tienen y las existentes no las tenían registradas, y única, porque identifican a la asociación tanto como su nombre. Igual que con el nombre, el servicio comprueba que no se repitan sin distinguir mayúsculas, para responder con el error en el campo y no con el de la restricción de la tabla.</w:t>
+      </w:r>
+    </w:p>
+    <w:p>
+      <w:pPr>
+        <w:spacing w:after="160" w:line="300"/>
+        <w:jc w:val="both"/>
+      </w:pPr>
+      <w:r>
+        <w:rPr>
+          <w:rFonts w:ascii="Times New Roman" w:cs="Times New Roman" w:eastAsia="Times New Roman" w:hAnsi="Times New Roman"/>
+          <w:sz w:val="24"/>
+          <w:szCs w:val="24"/>
+        </w:rPr>
+        <w:t xml:space="preserve">Las siglas encabezan la tarjeta y la página de la asociación, con el nombre completo debajo, y forman parte del texto de búsqueda, de modo que buscar “aecctiuvg” la encuentra. En las tarjetas de eventos el organizador aparece por sus siglas, que caben en el espacio disponible, y en las listas de selección del panel y de los filtros se muestran las siglas seguidas del nombre completo, ordenadas por esa etiqueta, para encontrar la asociación por cualquiera de las dos formas. Los clubes no registran siglas.</w:t>
+      </w:r>
+    </w:p>
+    <w:p>
+      <w:pPr>
+        <w:spacing w:after="160" w:line="300"/>
+        <w:jc w:val="both"/>
+      </w:pPr>
+      <w:r>
+        <w:rPr>
+          <w:rFonts w:ascii="Times New Roman" w:cs="Times New Roman" w:eastAsia="Times New Roman" w:hAnsi="Times New Roman"/>
+          <w:sz w:val="24"/>
+          <w:szCs w:val="24"/>
+        </w:rPr>
+        <w:t xml:space="preserve">Durante la verificación se encontró que el logotipo del encabezado de una organización rompía la página cuando su enlace apuntaba a un dominio externo: el optimizador de imágenes de Next rechaza los dominios que no se declaran de antemano, y el panel admite cualquier enlace. Se cambió por una imagen normal, la misma decisión que ya se había tomado para las imágenes de los eventos en el Sprint 2.</w:t>
+      </w:r>
+    </w:p>
+    <w:p>
+      <w:pPr>
+        <w:pStyle w:val="Heading2"/>
+        <w:spacing w:after="160" w:before="280"/>
+      </w:pPr>
+      <w:r>
+        <w:rPr>
+          <w:rFonts w:ascii="Times New Roman" w:cs="Times New Roman" w:eastAsia="Times New Roman" w:hAnsi="Times New Roman"/>
+          <w:b/>
+          <w:bCs/>
+          <w:color w:val="000000"/>
+          <w:sz w:val="30"/>
+          <w:szCs w:val="30"/>
+        </w:rPr>
+        <w:t xml:space="preserve">9.3. Tarjetas de asociaciones y clubes</w:t>
+      </w:r>
+    </w:p>
+    <w:p>
+      <w:pPr>
+        <w:spacing w:after="160" w:line="300"/>
+        <w:jc w:val="both"/>
+      </w:pPr>
+      <w:r>
+        <w:rPr>
+          <w:rFonts w:ascii="Times New Roman" w:cs="Times New Roman" w:eastAsia="Times New Roman" w:hAnsi="Times New Roman"/>
+          <w:sz w:val="24"/>
+          <w:szCs w:val="24"/>
+        </w:rPr>
+        <w:t xml:space="preserve">La tarjeta de las organizaciones pasó a la misma estructura que la de los eventos, con la imagen en una franja superior y los datos debajo, que es la forma que el estudiantado ya reconoce en el sitio y le da más presencia a la imagen. A diferencia del afiche de un evento, la imagen de una organización casi siempre es un logotipo y recortarlo le quitaría justo los bordes; por eso se muestra completo y detrás se coloca la misma imagen ampliada y desenfocada, de modo que todas las tarjetas midan igual sin dejar bandas vacías. Sin imagen se presentan las siglas, o las iniciales del nombre, sobre un degradado.</w:t>
+      </w:r>
+    </w:p>
+    <w:p>
+      <w:pPr>
+        <w:pStyle w:val="Heading2"/>
+        <w:spacing w:after="160" w:before="280"/>
+      </w:pPr>
+      <w:r>
+        <w:rPr>
+          <w:rFonts w:ascii="Times New Roman" w:cs="Times New Roman" w:eastAsia="Times New Roman" w:hAnsi="Times New Roman"/>
+          <w:b/>
+          <w:bCs/>
+          <w:color w:val="000000"/>
+          <w:sz w:val="30"/>
+          <w:szCs w:val="30"/>
+        </w:rPr>
+        <w:t xml:space="preserve">9.4. Portada con el carrusel de próximos eventos</w:t>
+      </w:r>
+    </w:p>
+    <w:p>
+      <w:pPr>
+        <w:spacing w:after="160" w:line="300"/>
+        <w:jc w:val="both"/>
+      </w:pPr>
+      <w:r>
+        <w:rPr>
+          <w:rFonts w:ascii="Times New Roman" w:cs="Times New Roman" w:eastAsia="Times New Roman" w:hAnsi="Times New Roman"/>
+          <w:sz w:val="24"/>
+          <w:szCs w:val="24"/>
+        </w:rPr>
+        <w:t xml:space="preserve">La portada era la pantalla más sencilla del sitio. El titular se revela ahora palabra por palabra, y tres de sus palabras toman los acentos del logo en sus variantes oscurecidas, las mismas de las categorías de eventos, que sí se leen sobre el fondo crema. Entre el texto y los botones se agregó un carrusel con hasta diez eventos próximos: primero los destacados por AEUVG y después los más cercanos, presentados en orden de fecha. Cada tarjeta muestra la imagen del evento a todo su tamaño, la fecha, la categoría, si es destacado, el nombre, la hora y el lugar.</w:t>
+      </w:r>
+    </w:p>
+    <w:p>
+      <w:pPr>
+        <w:spacing w:after="160" w:line="300"/>
+        <w:jc w:val="both"/>
+      </w:pPr>
+      <w:r>
+        <w:rPr>
+          <w:rFonts w:ascii="Times New Roman" w:cs="Times New Roman" w:eastAsia="Times New Roman" w:hAnsi="Times New Roman"/>
+          <w:sz w:val="24"/>
+          <w:szCs w:val="24"/>
+        </w:rPr>
+        <w:t xml:space="preserve">Una primera versión usó un fondo oscuro y boletos sin imagen; se descartó porque rompía el diseño del resto de las páginas y porque la imagen del evento es justamente lo que llama la atención. El carrusel avanza solo y se detiene cuando el cursor o el foco del teclado están sobre él y con un botón de pausa, que es lo que exige la accesibilidad para contenido que se mueve más de cinco segundos. Tiene además flechas a los lados y se desliza con el dedo en el teléfono; quien pidió al sistema reducir el movimiento recibe la fila quieta y la recorre a mano.</w:t>
+      </w:r>
+    </w:p>
+    <w:p>
+      <w:pPr>
+        <w:spacing w:after="160" w:line="300"/>
+        <w:jc w:val="both"/>
+      </w:pPr>
+      <w:r>
+        <w:rPr>
+          <w:rFonts w:ascii="Times New Roman" w:cs="Times New Roman" w:eastAsia="Times New Roman" w:hAnsi="Times New Roman"/>
+          <w:sz w:val="24"/>
+          <w:szCs w:val="24"/>
+        </w:rPr>
+        <w:t xml:space="preserve">Técnicamente es un desplazamiento horizontal real que avanza cuadro a cuadro, y no una animación de estilos, para que el avance automático, las flechas y el dedo muevan la misma fila. Para que nunca se acabe lleva dos copias de los eventos: al recorrer la primera, el desplazamiento vuelve al inicio sin que se note, porque la segunda ocupa exactamente el mismo lugar. Las copias no reciben el foco del teclado ni las leen los lectores de pantalla, de modo que cada evento se recorre una sola vez.</w:t>
+      </w:r>
+    </w:p>
+    <w:p>
+      <w:pPr>
+        <w:pStyle w:val="Heading2"/>
+        <w:spacing w:after="160" w:before="280"/>
+      </w:pPr>
+      <w:r>
+        <w:rPr>
+          <w:rFonts w:ascii="Times New Roman" w:cs="Times New Roman" w:eastAsia="Times New Roman" w:hAnsi="Times New Roman"/>
+          <w:b/>
+          <w:bCs/>
+          <w:color w:val="000000"/>
+          <w:sz w:val="30"/>
+          <w:szCs w:val="30"/>
+        </w:rPr>
+        <w:t xml:space="preserve">9.5. Navegación del panel</w:t>
+      </w:r>
+    </w:p>
+    <w:p>
+      <w:pPr>
+        <w:spacing w:after="160" w:line="300"/>
+        <w:jc w:val="both"/>
+      </w:pPr>
+      <w:r>
+        <w:rPr>
+          <w:rFonts w:ascii="Times New Roman" w:cs="Times New Roman" w:eastAsia="Times New Roman" w:hAnsi="Times New Roman"/>
+          <w:sz w:val="24"/>
+          <w:szCs w:val="24"/>
+        </w:rPr>
+        <w:t xml:space="preserve">La sección de estudiantes pasó al segundo lugar de la barra lateral del panel, inmediatamente debajo del resumen. El cambio es solo de orden y no de funcionalidad; como el orden de la barra es también el de las tarjetas de la página de resumen, cambió en los dos lugares.</w:t>
+      </w:r>
+    </w:p>
+    <w:p>
+      <w:pPr>
+        <w:pStyle w:val="Heading2"/>
+        <w:spacing w:after="160" w:before="280"/>
+      </w:pPr>
+      <w:r>
+        <w:rPr>
+          <w:rFonts w:ascii="Times New Roman" w:cs="Times New Roman" w:eastAsia="Times New Roman" w:hAnsi="Times New Roman"/>
+          <w:b/>
+          <w:bCs/>
+          <w:color w:val="000000"/>
+          <w:sz w:val="30"/>
+          <w:szCs w:val="30"/>
+        </w:rPr>
+        <w:t xml:space="preserve">9.6. Contenido de demostración</w:t>
+      </w:r>
+    </w:p>
+    <w:p>
+      <w:pPr>
+        <w:spacing w:after="160" w:line="300"/>
+        <w:jc w:val="both"/>
+      </w:pPr>
+      <w:r>
+        <w:rPr>
+          <w:rFonts w:ascii="Times New Roman" w:cs="Times New Roman" w:eastAsia="Times New Roman" w:hAnsi="Times New Roman"/>
+          <w:sz w:val="24"/>
+          <w:szCs w:val="24"/>
+        </w:rPr>
+        <w:t xml:space="preserve">Mientras AEUVG carga su información real, el sitio se veía casi vacío y el carrusel no podía apreciarse. Se preparó un contenido de demostración con cinco asociaciones y doce eventos próximos, con categorías, organizadores y varios destacados. Sus logotipos e ilustraciones se generan con un script del repositorio a partir de figuras simples: no dependen de fotografías con derechos de autor, pesan unos pocos kilobytes y se sirven como archivos del propio sitio, sin pasar por el volumen de imágenes subidas. Los validadores aceptan esas rutas como imágenes propias, para que editar uno de estos eventos desde el panel no rompa su imagen.</w:t>
+      </w:r>
+    </w:p>
+    <w:p>
+      <w:pPr>
+        <w:spacing w:after="160" w:line="300"/>
+        <w:jc w:val="both"/>
+      </w:pPr>
+      <w:r>
+        <w:rPr>
+          <w:rFonts w:ascii="Times New Roman" w:cs="Times New Roman" w:eastAsia="Times New Roman" w:hAnsi="Times New Roman"/>
+          <w:sz w:val="24"/>
+          <w:szCs w:val="24"/>
+        </w:rPr>
+        <w:t xml:space="preserve">La carga es idempotente, exige confirmarla de forma explícita en el comando y fecha los eventos a partir del día en que se ejecuta, de modo que repetirla los vuelve a mover al futuro. Nunca toca contenido real: reconoce lo suyo por el nombre y por la imagen de demostración, y omite cualquier asociación real con el mismo nombre o las mismas siglas. Se retira con un solo comando, que conserva una asociación de demostración si alguien la usó como organizadora de un evento real. Se cargó en producción el 8 de octubre.</w:t>
+      </w:r>
+    </w:p>
+    <w:p>
+      <w:pPr>
+        <w:pStyle w:val="Heading2"/>
+        <w:spacing w:after="160" w:before="280"/>
+      </w:pPr>
+      <w:r>
+        <w:rPr>
+          <w:rFonts w:ascii="Times New Roman" w:cs="Times New Roman" w:eastAsia="Times New Roman" w:hAnsi="Times New Roman"/>
+          <w:b/>
+          <w:bCs/>
+          <w:color w:val="000000"/>
+          <w:sz w:val="30"/>
+          <w:szCs w:val="30"/>
+        </w:rPr>
+        <w:t xml:space="preserve">9.7. Publicación en producción</w:t>
+      </w:r>
+    </w:p>
+    <w:p>
+      <w:pPr>
+        <w:spacing w:after="160" w:line="300"/>
+        <w:jc w:val="both"/>
+      </w:pPr>
+      <w:r>
+        <w:rPr>
+          <w:rFonts w:ascii="Times New Roman" w:cs="Times New Roman" w:eastAsia="Times New Roman" w:hAnsi="Times New Roman"/>
+          <w:sz w:val="24"/>
+          <w:szCs w:val="24"/>
+        </w:rPr>
+        <w:t xml:space="preserve">La primera publicación de las siglas dejó con error las páginas de asociaciones, eventos y calendario y los formularios del panel: el código nuevo consultaba la columna de siglas antes de que su migración se aplicara en Railway, donde las migraciones no se ejecutan con el despliegue por una decisión documentada desde el Sprint 1. Se resolvió aplicando la migración mediante el túnel cifrado, sin pérdida de información y sin volver a desplegar; las páginas se recuperaron en cuanto terminó.</w:t>
+      </w:r>
+    </w:p>
+    <w:p>
+      <w:pPr>
+        <w:spacing w:after="160" w:line="300"/>
+        <w:jc w:val="both"/>
+      </w:pPr>
+      <w:r>
+        <w:rPr>
+          <w:rFonts w:ascii="Times New Roman" w:cs="Times New Roman" w:eastAsia="Times New Roman" w:hAnsi="Times New Roman"/>
+          <w:sz w:val="24"/>
+          <w:szCs w:val="24"/>
+        </w:rPr>
+        <w:t xml:space="preserve">Para no depender de una sola persona en la operación, ambos integrantes cuentan ahora con acceso al proyecto de Railway. El procedimiento de despliegue se actualizó para que una migración que solo agrega columnas o tablas se aplique antes de publicar el código y no después: el código anterior la ignora, y así no existe un intervalo en el que el sitio falle.</w:t>
+      </w:r>
+    </w:p>
+    <w:p>
+      <w:pPr>
+        <w:pStyle w:val="Heading1"/>
+        <w:spacing w:after="200" w:before="360"/>
+      </w:pPr>
+      <w:r>
+        <w:rPr>
+          <w:rFonts w:ascii="Times New Roman" w:cs="Times New Roman" w:eastAsia="Times New Roman" w:hAnsi="Times New Roman"/>
+          <w:b/>
+          <w:bCs/>
+          <w:color w:val="000000"/>
+          <w:sz w:val="34"/>
+          <w:szCs w:val="34"/>
+        </w:rPr>
+        <w:t xml:space="preserve">10. Estado del sprint</w:t>
+      </w:r>
+    </w:p>
+    <w:p>
+      <w:pPr>
+        <w:spacing w:after="160" w:line="300"/>
+        <w:jc w:val="both"/>
+      </w:pPr>
+      <w:r>
+        <w:rPr>
+          <w:rFonts w:ascii="Times New Roman" w:cs="Times New Roman" w:eastAsia="Times New Roman" w:hAnsi="Times New Roman"/>
+          <w:sz w:val="24"/>
+          <w:szCs w:val="24"/>
+        </w:rPr>
+        <w:t xml:space="preserve">Las seis historias comprometidas para el Sprint 3 se encuentran completadas, con 40.9 horas de trabajo de equipo frente a las 28 estimadas; la diferencia corresponde a los ajustes finales de la sección 9. El detalle por sesión se encuentra en la sección 11. La plataforma cuenta ahora con:</w:t>
       </w:r>
     </w:p>
     <w:p>
@@ -2185,7 +2691,12 @@
     </w:p>
     <w:p>
       <w:pPr>
-        <w:spacing w:after="160" w:line="300"/>
+        <w:pStyle w:val="ListParagraph"/>
+        <w:numPr>
+          <w:ilvl w:val="0"/>
+          <w:numId w:val="2"/>
+        </w:numPr>
+        <w:spacing w:after="100" w:line="300"/>
         <w:jc w:val="both"/>
       </w:pPr>
       <w:r>
@@ -2194,7 +2705,78 @@
           <w:sz w:val="24"/>
           <w:szCs w:val="24"/>
         </w:rPr>
-        <w:t xml:space="preserve">Queda pendiente de AEUVG la carga de la información real de las asociaciones y clubes del campus, incluidas las fotografías de sus juntas directivas. No bloquea el sprint: la administración quedó lista y el módulo funciona con la información de prueba. Continúa también en gestión el trámite del dominio institucional iniciado en el Sprint 1.</w:t>
+        <w:t xml:space="preserve">Las siglas de cada asociación, presentes en sus tarjetas, su página, los eventos que organiza y el buscador.</w:t>
+      </w:r>
+    </w:p>
+    <w:p>
+      <w:pPr>
+        <w:pStyle w:val="ListParagraph"/>
+        <w:numPr>
+          <w:ilvl w:val="0"/>
+          <w:numId w:val="2"/>
+        </w:numPr>
+        <w:spacing w:after="100" w:line="300"/>
+        <w:jc w:val="both"/>
+      </w:pPr>
+      <w:r>
+        <w:rPr>
+          <w:rFonts w:ascii="Times New Roman" w:cs="Times New Roman" w:eastAsia="Times New Roman" w:hAnsi="Times New Roman"/>
+          <w:sz w:val="24"/>
+          <w:szCs w:val="24"/>
+        </w:rPr>
+        <w:t xml:space="preserve">Una portada renovada con el carrusel de próximos eventos y tarjetas de asociaciones y clubes con la imagen destacada.</w:t>
+      </w:r>
+    </w:p>
+    <w:p>
+      <w:pPr>
+        <w:pStyle w:val="ListParagraph"/>
+        <w:numPr>
+          <w:ilvl w:val="0"/>
+          <w:numId w:val="2"/>
+        </w:numPr>
+        <w:spacing w:after="100" w:line="300"/>
+        <w:jc w:val="both"/>
+      </w:pPr>
+      <w:r>
+        <w:rPr>
+          <w:rFonts w:ascii="Times New Roman" w:cs="Times New Roman" w:eastAsia="Times New Roman" w:hAnsi="Times New Roman"/>
+          <w:sz w:val="24"/>
+          <w:szCs w:val="24"/>
+        </w:rPr>
+        <w:t xml:space="preserve">El asterisco de campo obligatorio en todos los formularios del sitio.</w:t>
+      </w:r>
+    </w:p>
+    <w:p>
+      <w:pPr>
+        <w:pStyle w:val="ListParagraph"/>
+        <w:numPr>
+          <w:ilvl w:val="0"/>
+          <w:numId w:val="2"/>
+        </w:numPr>
+        <w:spacing w:after="100" w:line="300"/>
+        <w:jc w:val="both"/>
+      </w:pPr>
+      <w:r>
+        <w:rPr>
+          <w:rFonts w:ascii="Times New Roman" w:cs="Times New Roman" w:eastAsia="Times New Roman" w:hAnsi="Times New Roman"/>
+          <w:sz w:val="24"/>
+          <w:szCs w:val="24"/>
+        </w:rPr>
+        <w:t xml:space="preserve">El contenido de demostración cargado en producción, retirable con un solo comando.</w:t>
+      </w:r>
+    </w:p>
+    <w:p>
+      <w:pPr>
+        <w:spacing w:after="160" w:line="300"/>
+        <w:jc w:val="both"/>
+      </w:pPr>
+      <w:r>
+        <w:rPr>
+          <w:rFonts w:ascii="Times New Roman" w:cs="Times New Roman" w:eastAsia="Times New Roman" w:hAnsi="Times New Roman"/>
+          <w:sz w:val="24"/>
+          <w:szCs w:val="24"/>
+        </w:rPr>
+        <w:t xml:space="preserve">Queda pendiente de AEUVG la carga de la información real de las asociaciones y clubes del campus, incluidas las fotografías de sus juntas directivas y las siglas de cada asociación. No bloquea el sprint: la administración quedó lista y el módulo funciona con el contenido de demostración, que deberá retirarse antes de la entrega final para que el sitio presente únicamente información real. Continúa también en gestión el trámite del dominio institucional iniciado en el Sprint 1.</w:t>
       </w:r>
     </w:p>
     <w:p>
@@ -2239,7 +2821,7 @@
           <w:sz w:val="34"/>
           <w:szCs w:val="34"/>
         </w:rPr>
-        <w:t xml:space="preserve">10. Registro de tiempos</w:t>
+        <w:t xml:space="preserve">11. Registro de tiempos</w:t>
       </w:r>
     </w:p>
     <w:p>
@@ -2253,7 +2835,7 @@
           <w:sz w:val="24"/>
           <w:szCs w:val="24"/>
         </w:rPr>
-        <w:t xml:space="preserve">Esta sección registra el tiempo dedicado por cada integrante al Sprint 3, entre el 24 de septiembre y el 7 de octubre de 2026. Cada sesión indica la fecha, la hora de inicio y de finalización, el tiempo de interrupción, el tiempo neto trabajado, la fase de la actividad y una descripción del trabajo realizado.</w:t>
+        <w:t xml:space="preserve">Esta sección registra el tiempo dedicado por cada integrante al Sprint 3, entre el 24 de septiembre y el 10 de octubre de 2026, incluidos los ajustes finales realizados después de la revisión. Cada sesión indica la fecha, la hora de inicio y de finalización, el tiempo de interrupción, el tiempo neto trabajado, la fase de la actividad y una descripción del trabajo realizado.</w:t>
       </w:r>
     </w:p>
     <w:p>
@@ -2281,7 +2863,7 @@
           <w:sz w:val="24"/>
           <w:szCs w:val="24"/>
         </w:rPr>
-        <w:t xml:space="preserve">El sprint sumó 29.0 horas de equipo: 18.0 horas de Harry Méndez y 11.0 horas de Juan Gabriel Gualim, frente a las 28 horas estimadas en la planificación, es decir, un 4% por encima de lo previsto. La estimación se calculó con la velocidad medida en el Sprint 2 y este sprint reutilizó los componentes de listado, paginación, estado vacío y carga de imágenes construidos en aquel, lo que mantuvo el tiempo real cerca de lo previsto. La diferencia corresponde al día de cierre: la revisión con AEUVG dejó observaciones que se resolvieron el mismo 7 de octubre, antes de publicar la versión final del sprint.</w:t>
+        <w:t xml:space="preserve">El sprint sumó 40.9 horas de equipo: 24.2 horas de Harry Méndez y 16.8 horas de Juan Gabriel Gualim, frente a las 28 horas estimadas en la planificación, es decir, un 46% por encima de lo previsto. Hasta la revisión del 7 de octubre el sprint se mantuvo cerca de lo previsto: la estimación se calculó con la velocidad medida en el Sprint 2 y se reutilizaron los componentes de listado, paginación, estado vacío y carga de imágenes construidos en aquel. La desviación corresponde casi por completo a los ajustes finales del 7 al 10 de octubre (las siglas de las asociaciones, el rediseño de las tarjetas, la nueva portada con el carrusel de eventos, los campos obligatorios y el contenido de demostración), que no formaban parte de la estimación original y se incorporaron para cerrar el sprint con la plataforma lista para presentarse a AEUVG.</w:t>
       </w:r>
     </w:p>
     <w:p>
@@ -2298,7 +2880,7 @@
           <w:sz w:val="30"/>
           <w:szCs w:val="30"/>
         </w:rPr>
-        <w:t xml:space="preserve">10.1. Harry Daniel Méndez Mendoza - 24089</w:t>
+        <w:t xml:space="preserve">11.1. Harry Daniel Méndez Mendoza - 24089</w:t>
       </w:r>
     </w:p>
     <w:p>
@@ -6017,6 +6599,1110 @@
           </w:p>
         </w:tc>
       </w:tr>
+      <w:tr>
+        <w:tc>
+          <w:tcPr>
+            <w:tcW w:type="dxa" w:w="900"/>
+            <w:tcMar>
+              <w:top w:type="dxa" w:w="80"/>
+              <w:left w:type="dxa" w:w="120"/>
+              <w:bottom w:type="dxa" w:w="80"/>
+              <w:right w:type="dxa" w:w="120"/>
+            </w:tcMar>
+          </w:tcPr>
+          <w:p>
+            <w:pPr>
+              <w:spacing w:after="0"/>
+            </w:pPr>
+            <w:r>
+              <w:rPr>
+                <w:rFonts w:ascii="Times New Roman" w:cs="Times New Roman" w:eastAsia="Times New Roman" w:hAnsi="Times New Roman"/>
+                <w:b w:val="false"/>
+                <w:bCs w:val="false"/>
+                <w:sz w:val="24"/>
+                <w:szCs w:val="24"/>
+              </w:rPr>
+              <w:t xml:space="preserve">08/10/2026</w:t>
+            </w:r>
+          </w:p>
+        </w:tc>
+        <w:tc>
+          <w:tcPr>
+            <w:tcW w:type="dxa" w:w="680"/>
+            <w:tcMar>
+              <w:top w:type="dxa" w:w="80"/>
+              <w:left w:type="dxa" w:w="120"/>
+              <w:bottom w:type="dxa" w:w="80"/>
+              <w:right w:type="dxa" w:w="120"/>
+            </w:tcMar>
+          </w:tcPr>
+          <w:p>
+            <w:pPr>
+              <w:spacing w:after="0"/>
+            </w:pPr>
+            <w:r>
+              <w:rPr>
+                <w:rFonts w:ascii="Times New Roman" w:cs="Times New Roman" w:eastAsia="Times New Roman" w:hAnsi="Times New Roman"/>
+                <w:b w:val="false"/>
+                <w:bCs w:val="false"/>
+                <w:sz w:val="24"/>
+                <w:szCs w:val="24"/>
+              </w:rPr>
+              <w:t xml:space="preserve">00:20</w:t>
+            </w:r>
+          </w:p>
+        </w:tc>
+        <w:tc>
+          <w:tcPr>
+            <w:tcW w:type="dxa" w:w="680"/>
+            <w:tcMar>
+              <w:top w:type="dxa" w:w="80"/>
+              <w:left w:type="dxa" w:w="120"/>
+              <w:bottom w:type="dxa" w:w="80"/>
+              <w:right w:type="dxa" w:w="120"/>
+            </w:tcMar>
+          </w:tcPr>
+          <w:p>
+            <w:pPr>
+              <w:spacing w:after="0"/>
+            </w:pPr>
+            <w:r>
+              <w:rPr>
+                <w:rFonts w:ascii="Times New Roman" w:cs="Times New Roman" w:eastAsia="Times New Roman" w:hAnsi="Times New Roman"/>
+                <w:b w:val="false"/>
+                <w:bCs w:val="false"/>
+                <w:sz w:val="24"/>
+                <w:szCs w:val="24"/>
+              </w:rPr>
+              <w:t xml:space="preserve">01:35</w:t>
+            </w:r>
+          </w:p>
+        </w:tc>
+        <w:tc>
+          <w:tcPr>
+            <w:tcW w:type="dxa" w:w="1120"/>
+            <w:tcMar>
+              <w:top w:type="dxa" w:w="80"/>
+              <w:left w:type="dxa" w:w="120"/>
+              <w:bottom w:type="dxa" w:w="80"/>
+              <w:right w:type="dxa" w:w="120"/>
+            </w:tcMar>
+          </w:tcPr>
+          <w:p>
+            <w:pPr>
+              <w:spacing w:after="0"/>
+            </w:pPr>
+            <w:r>
+              <w:rPr>
+                <w:rFonts w:ascii="Times New Roman" w:cs="Times New Roman" w:eastAsia="Times New Roman" w:hAnsi="Times New Roman"/>
+                <w:b w:val="false"/>
+                <w:bCs w:val="false"/>
+                <w:sz w:val="24"/>
+                <w:szCs w:val="24"/>
+              </w:rPr>
+              <w:t xml:space="preserve">0:10</w:t>
+            </w:r>
+          </w:p>
+        </w:tc>
+        <w:tc>
+          <w:tcPr>
+            <w:tcW w:type="dxa" w:w="900"/>
+            <w:tcMar>
+              <w:top w:type="dxa" w:w="80"/>
+              <w:left w:type="dxa" w:w="120"/>
+              <w:bottom w:type="dxa" w:w="80"/>
+              <w:right w:type="dxa" w:w="120"/>
+            </w:tcMar>
+          </w:tcPr>
+          <w:p>
+            <w:pPr>
+              <w:spacing w:after="0"/>
+            </w:pPr>
+            <w:r>
+              <w:rPr>
+                <w:rFonts w:ascii="Times New Roman" w:cs="Times New Roman" w:eastAsia="Times New Roman" w:hAnsi="Times New Roman"/>
+                <w:b w:val="false"/>
+                <w:bCs w:val="false"/>
+                <w:sz w:val="24"/>
+                <w:szCs w:val="24"/>
+              </w:rPr>
+              <w:t xml:space="preserve">1:05</w:t>
+            </w:r>
+          </w:p>
+        </w:tc>
+        <w:tc>
+          <w:tcPr>
+            <w:tcW w:type="dxa" w:w="1280"/>
+            <w:tcMar>
+              <w:top w:type="dxa" w:w="80"/>
+              <w:left w:type="dxa" w:w="120"/>
+              <w:bottom w:type="dxa" w:w="80"/>
+              <w:right w:type="dxa" w:w="120"/>
+            </w:tcMar>
+          </w:tcPr>
+          <w:p>
+            <w:pPr>
+              <w:spacing w:after="0"/>
+            </w:pPr>
+            <w:r>
+              <w:rPr>
+                <w:rFonts w:ascii="Times New Roman" w:cs="Times New Roman" w:eastAsia="Times New Roman" w:hAnsi="Times New Roman"/>
+                <w:b w:val="false"/>
+                <w:bCs w:val="false"/>
+                <w:sz w:val="24"/>
+                <w:szCs w:val="24"/>
+              </w:rPr>
+              <w:t xml:space="preserve">Codificación y pruebas</w:t>
+            </w:r>
+          </w:p>
+        </w:tc>
+        <w:tc>
+          <w:tcPr>
+            <w:tcW w:type="dxa" w:w="3800"/>
+            <w:tcMar>
+              <w:top w:type="dxa" w:w="80"/>
+              <w:left w:type="dxa" w:w="120"/>
+              <w:bottom w:type="dxa" w:w="80"/>
+              <w:right w:type="dxa" w:w="120"/>
+            </w:tcMar>
+          </w:tcPr>
+          <w:p>
+            <w:pPr>
+              <w:spacing w:after="0"/>
+            </w:pPr>
+            <w:r>
+              <w:rPr>
+                <w:rFonts w:ascii="Times New Roman" w:cs="Times New Roman" w:eastAsia="Times New Roman" w:hAnsi="Times New Roman"/>
+                <w:b w:val="false"/>
+                <w:bCs w:val="false"/>
+                <w:sz w:val="24"/>
+                <w:szCs w:val="24"/>
+              </w:rPr>
+              <w:t xml:space="preserve">Migración de las siglas de las asociaciones, con su validación, la comprobación de siglas repetidas en el servicio, su inclusión en el texto de búsqueda y sus pruebas.</w:t>
+            </w:r>
+          </w:p>
+        </w:tc>
+      </w:tr>
+      <w:tr>
+        <w:tc>
+          <w:tcPr>
+            <w:tcW w:type="dxa" w:w="900"/>
+            <w:tcMar>
+              <w:top w:type="dxa" w:w="80"/>
+              <w:left w:type="dxa" w:w="120"/>
+              <w:bottom w:type="dxa" w:w="80"/>
+              <w:right w:type="dxa" w:w="120"/>
+            </w:tcMar>
+          </w:tcPr>
+          <w:p>
+            <w:pPr>
+              <w:spacing w:after="0"/>
+            </w:pPr>
+            <w:r>
+              <w:rPr>
+                <w:rFonts w:ascii="Times New Roman" w:cs="Times New Roman" w:eastAsia="Times New Roman" w:hAnsi="Times New Roman"/>
+                <w:b w:val="false"/>
+                <w:bCs w:val="false"/>
+                <w:sz w:val="24"/>
+                <w:szCs w:val="24"/>
+              </w:rPr>
+              <w:t xml:space="preserve">08/10/2026</w:t>
+            </w:r>
+          </w:p>
+        </w:tc>
+        <w:tc>
+          <w:tcPr>
+            <w:tcW w:type="dxa" w:w="680"/>
+            <w:tcMar>
+              <w:top w:type="dxa" w:w="80"/>
+              <w:left w:type="dxa" w:w="120"/>
+              <w:bottom w:type="dxa" w:w="80"/>
+              <w:right w:type="dxa" w:w="120"/>
+            </w:tcMar>
+          </w:tcPr>
+          <w:p>
+            <w:pPr>
+              <w:spacing w:after="0"/>
+            </w:pPr>
+            <w:r>
+              <w:rPr>
+                <w:rFonts w:ascii="Times New Roman" w:cs="Times New Roman" w:eastAsia="Times New Roman" w:hAnsi="Times New Roman"/>
+                <w:b w:val="false"/>
+                <w:bCs w:val="false"/>
+                <w:sz w:val="24"/>
+                <w:szCs w:val="24"/>
+              </w:rPr>
+              <w:t xml:space="preserve">09:30</w:t>
+            </w:r>
+          </w:p>
+        </w:tc>
+        <w:tc>
+          <w:tcPr>
+            <w:tcW w:type="dxa" w:w="680"/>
+            <w:tcMar>
+              <w:top w:type="dxa" w:w="80"/>
+              <w:left w:type="dxa" w:w="120"/>
+              <w:bottom w:type="dxa" w:w="80"/>
+              <w:right w:type="dxa" w:w="120"/>
+            </w:tcMar>
+          </w:tcPr>
+          <w:p>
+            <w:pPr>
+              <w:spacing w:after="0"/>
+            </w:pPr>
+            <w:r>
+              <w:rPr>
+                <w:rFonts w:ascii="Times New Roman" w:cs="Times New Roman" w:eastAsia="Times New Roman" w:hAnsi="Times New Roman"/>
+                <w:b w:val="false"/>
+                <w:bCs w:val="false"/>
+                <w:sz w:val="24"/>
+                <w:szCs w:val="24"/>
+              </w:rPr>
+              <w:t xml:space="preserve">10:20</w:t>
+            </w:r>
+          </w:p>
+        </w:tc>
+        <w:tc>
+          <w:tcPr>
+            <w:tcW w:type="dxa" w:w="1120"/>
+            <w:tcMar>
+              <w:top w:type="dxa" w:w="80"/>
+              <w:left w:type="dxa" w:w="120"/>
+              <w:bottom w:type="dxa" w:w="80"/>
+              <w:right w:type="dxa" w:w="120"/>
+            </w:tcMar>
+          </w:tcPr>
+          <w:p>
+            <w:pPr>
+              <w:spacing w:after="0"/>
+            </w:pPr>
+            <w:r>
+              <w:rPr>
+                <w:rFonts w:ascii="Times New Roman" w:cs="Times New Roman" w:eastAsia="Times New Roman" w:hAnsi="Times New Roman"/>
+                <w:b w:val="false"/>
+                <w:bCs w:val="false"/>
+                <w:sz w:val="24"/>
+                <w:szCs w:val="24"/>
+              </w:rPr>
+              <w:t xml:space="preserve">0:05</w:t>
+            </w:r>
+          </w:p>
+        </w:tc>
+        <w:tc>
+          <w:tcPr>
+            <w:tcW w:type="dxa" w:w="900"/>
+            <w:tcMar>
+              <w:top w:type="dxa" w:w="80"/>
+              <w:left w:type="dxa" w:w="120"/>
+              <w:bottom w:type="dxa" w:w="80"/>
+              <w:right w:type="dxa" w:w="120"/>
+            </w:tcMar>
+          </w:tcPr>
+          <w:p>
+            <w:pPr>
+              <w:spacing w:after="0"/>
+            </w:pPr>
+            <w:r>
+              <w:rPr>
+                <w:rFonts w:ascii="Times New Roman" w:cs="Times New Roman" w:eastAsia="Times New Roman" w:hAnsi="Times New Roman"/>
+                <w:b w:val="false"/>
+                <w:bCs w:val="false"/>
+                <w:sz w:val="24"/>
+                <w:szCs w:val="24"/>
+              </w:rPr>
+              <w:t xml:space="preserve">0:45</w:t>
+            </w:r>
+          </w:p>
+        </w:tc>
+        <w:tc>
+          <w:tcPr>
+            <w:tcW w:type="dxa" w:w="1280"/>
+            <w:tcMar>
+              <w:top w:type="dxa" w:w="80"/>
+              <w:left w:type="dxa" w:w="120"/>
+              <w:bottom w:type="dxa" w:w="80"/>
+              <w:right w:type="dxa" w:w="120"/>
+            </w:tcMar>
+          </w:tcPr>
+          <w:p>
+            <w:pPr>
+              <w:spacing w:after="0"/>
+            </w:pPr>
+            <w:r>
+              <w:rPr>
+                <w:rFonts w:ascii="Times New Roman" w:cs="Times New Roman" w:eastAsia="Times New Roman" w:hAnsi="Times New Roman"/>
+                <w:b w:val="false"/>
+                <w:bCs w:val="false"/>
+                <w:sz w:val="24"/>
+                <w:szCs w:val="24"/>
+              </w:rPr>
+              <w:t xml:space="preserve">Despliegue</w:t>
+            </w:r>
+          </w:p>
+        </w:tc>
+        <w:tc>
+          <w:tcPr>
+            <w:tcW w:type="dxa" w:w="3800"/>
+            <w:tcMar>
+              <w:top w:type="dxa" w:w="80"/>
+              <w:left w:type="dxa" w:w="120"/>
+              <w:bottom w:type="dxa" w:w="80"/>
+              <w:right w:type="dxa" w:w="120"/>
+            </w:tcMar>
+          </w:tcPr>
+          <w:p>
+            <w:pPr>
+              <w:spacing w:after="0"/>
+            </w:pPr>
+            <w:r>
+              <w:rPr>
+                <w:rFonts w:ascii="Times New Roman" w:cs="Times New Roman" w:eastAsia="Times New Roman" w:hAnsi="Times New Roman"/>
+                <w:b w:val="false"/>
+                <w:bCs w:val="false"/>
+                <w:sz w:val="24"/>
+                <w:szCs w:val="24"/>
+              </w:rPr>
+              <w:t xml:space="preserve">Diagnóstico de los errores en producción tras publicar las siglas: la migración no se había aplicado en Railway. Acceso al proyecto para Juan Gabriel y verificación del sitio.</w:t>
+            </w:r>
+          </w:p>
+        </w:tc>
+      </w:tr>
+      <w:tr>
+        <w:tc>
+          <w:tcPr>
+            <w:tcW w:type="dxa" w:w="900"/>
+            <w:tcMar>
+              <w:top w:type="dxa" w:w="80"/>
+              <w:left w:type="dxa" w:w="120"/>
+              <w:bottom w:type="dxa" w:w="80"/>
+              <w:right w:type="dxa" w:w="120"/>
+            </w:tcMar>
+          </w:tcPr>
+          <w:p>
+            <w:pPr>
+              <w:spacing w:after="0"/>
+            </w:pPr>
+            <w:r>
+              <w:rPr>
+                <w:rFonts w:ascii="Times New Roman" w:cs="Times New Roman" w:eastAsia="Times New Roman" w:hAnsi="Times New Roman"/>
+                <w:b w:val="false"/>
+                <w:bCs w:val="false"/>
+                <w:sz w:val="24"/>
+                <w:szCs w:val="24"/>
+              </w:rPr>
+              <w:t xml:space="preserve">08/10/2026</w:t>
+            </w:r>
+          </w:p>
+        </w:tc>
+        <w:tc>
+          <w:tcPr>
+            <w:tcW w:type="dxa" w:w="680"/>
+            <w:tcMar>
+              <w:top w:type="dxa" w:w="80"/>
+              <w:left w:type="dxa" w:w="120"/>
+              <w:bottom w:type="dxa" w:w="80"/>
+              <w:right w:type="dxa" w:w="120"/>
+            </w:tcMar>
+          </w:tcPr>
+          <w:p>
+            <w:pPr>
+              <w:spacing w:after="0"/>
+            </w:pPr>
+            <w:r>
+              <w:rPr>
+                <w:rFonts w:ascii="Times New Roman" w:cs="Times New Roman" w:eastAsia="Times New Roman" w:hAnsi="Times New Roman"/>
+                <w:b w:val="false"/>
+                <w:bCs w:val="false"/>
+                <w:sz w:val="24"/>
+                <w:szCs w:val="24"/>
+              </w:rPr>
+              <w:t xml:space="preserve">13:40</w:t>
+            </w:r>
+          </w:p>
+        </w:tc>
+        <w:tc>
+          <w:tcPr>
+            <w:tcW w:type="dxa" w:w="680"/>
+            <w:tcMar>
+              <w:top w:type="dxa" w:w="80"/>
+              <w:left w:type="dxa" w:w="120"/>
+              <w:bottom w:type="dxa" w:w="80"/>
+              <w:right w:type="dxa" w:w="120"/>
+            </w:tcMar>
+          </w:tcPr>
+          <w:p>
+            <w:pPr>
+              <w:spacing w:after="0"/>
+            </w:pPr>
+            <w:r>
+              <w:rPr>
+                <w:rFonts w:ascii="Times New Roman" w:cs="Times New Roman" w:eastAsia="Times New Roman" w:hAnsi="Times New Roman"/>
+                <w:b w:val="false"/>
+                <w:bCs w:val="false"/>
+                <w:sz w:val="24"/>
+                <w:szCs w:val="24"/>
+              </w:rPr>
+              <w:t xml:space="preserve">14:55</w:t>
+            </w:r>
+          </w:p>
+        </w:tc>
+        <w:tc>
+          <w:tcPr>
+            <w:tcW w:type="dxa" w:w="1120"/>
+            <w:tcMar>
+              <w:top w:type="dxa" w:w="80"/>
+              <w:left w:type="dxa" w:w="120"/>
+              <w:bottom w:type="dxa" w:w="80"/>
+              <w:right w:type="dxa" w:w="120"/>
+            </w:tcMar>
+          </w:tcPr>
+          <w:p>
+            <w:pPr>
+              <w:spacing w:after="0"/>
+            </w:pPr>
+            <w:r>
+              <w:rPr>
+                <w:rFonts w:ascii="Times New Roman" w:cs="Times New Roman" w:eastAsia="Times New Roman" w:hAnsi="Times New Roman"/>
+                <w:b w:val="false"/>
+                <w:bCs w:val="false"/>
+                <w:sz w:val="24"/>
+                <w:szCs w:val="24"/>
+              </w:rPr>
+              <w:t xml:space="preserve">0:10</w:t>
+            </w:r>
+          </w:p>
+        </w:tc>
+        <w:tc>
+          <w:tcPr>
+            <w:tcW w:type="dxa" w:w="900"/>
+            <w:tcMar>
+              <w:top w:type="dxa" w:w="80"/>
+              <w:left w:type="dxa" w:w="120"/>
+              <w:bottom w:type="dxa" w:w="80"/>
+              <w:right w:type="dxa" w:w="120"/>
+            </w:tcMar>
+          </w:tcPr>
+          <w:p>
+            <w:pPr>
+              <w:spacing w:after="0"/>
+            </w:pPr>
+            <w:r>
+              <w:rPr>
+                <w:rFonts w:ascii="Times New Roman" w:cs="Times New Roman" w:eastAsia="Times New Roman" w:hAnsi="Times New Roman"/>
+                <w:b w:val="false"/>
+                <w:bCs w:val="false"/>
+                <w:sz w:val="24"/>
+                <w:szCs w:val="24"/>
+              </w:rPr>
+              <w:t xml:space="preserve">1:05</w:t>
+            </w:r>
+          </w:p>
+        </w:tc>
+        <w:tc>
+          <w:tcPr>
+            <w:tcW w:type="dxa" w:w="1280"/>
+            <w:tcMar>
+              <w:top w:type="dxa" w:w="80"/>
+              <w:left w:type="dxa" w:w="120"/>
+              <w:bottom w:type="dxa" w:w="80"/>
+              <w:right w:type="dxa" w:w="120"/>
+            </w:tcMar>
+          </w:tcPr>
+          <w:p>
+            <w:pPr>
+              <w:spacing w:after="0"/>
+            </w:pPr>
+            <w:r>
+              <w:rPr>
+                <w:rFonts w:ascii="Times New Roman" w:cs="Times New Roman" w:eastAsia="Times New Roman" w:hAnsi="Times New Roman"/>
+                <w:b w:val="false"/>
+                <w:bCs w:val="false"/>
+                <w:sz w:val="24"/>
+                <w:szCs w:val="24"/>
+              </w:rPr>
+              <w:t xml:space="preserve">Codificación y pruebas</w:t>
+            </w:r>
+          </w:p>
+        </w:tc>
+        <w:tc>
+          <w:tcPr>
+            <w:tcW w:type="dxa" w:w="3800"/>
+            <w:tcMar>
+              <w:top w:type="dxa" w:w="80"/>
+              <w:left w:type="dxa" w:w="120"/>
+              <w:bottom w:type="dxa" w:w="80"/>
+              <w:right w:type="dxa" w:w="120"/>
+            </w:tcMar>
+          </w:tcPr>
+          <w:p>
+            <w:pPr>
+              <w:spacing w:after="0"/>
+            </w:pPr>
+            <w:r>
+              <w:rPr>
+                <w:rFonts w:ascii="Times New Roman" w:cs="Times New Roman" w:eastAsia="Times New Roman" w:hAnsi="Times New Roman"/>
+                <w:b w:val="false"/>
+                <w:bCs w:val="false"/>
+                <w:sz w:val="24"/>
+                <w:szCs w:val="24"/>
+              </w:rPr>
+              <w:t xml:space="preserve">Selección de los eventos del carrusel de la portada, con los destacados primero y en orden de fecha, y partes de la fecha en hora de Guatemala, con sus pruebas.</w:t>
+            </w:r>
+          </w:p>
+        </w:tc>
+      </w:tr>
+      <w:tr>
+        <w:tc>
+          <w:tcPr>
+            <w:tcW w:type="dxa" w:w="900"/>
+            <w:tcMar>
+              <w:top w:type="dxa" w:w="80"/>
+              <w:left w:type="dxa" w:w="120"/>
+              <w:bottom w:type="dxa" w:w="80"/>
+              <w:right w:type="dxa" w:w="120"/>
+            </w:tcMar>
+          </w:tcPr>
+          <w:p>
+            <w:pPr>
+              <w:spacing w:after="0"/>
+            </w:pPr>
+            <w:r>
+              <w:rPr>
+                <w:rFonts w:ascii="Times New Roman" w:cs="Times New Roman" w:eastAsia="Times New Roman" w:hAnsi="Times New Roman"/>
+                <w:b w:val="false"/>
+                <w:bCs w:val="false"/>
+                <w:sz w:val="24"/>
+                <w:szCs w:val="24"/>
+              </w:rPr>
+              <w:t xml:space="preserve">08/10/2026</w:t>
+            </w:r>
+          </w:p>
+        </w:tc>
+        <w:tc>
+          <w:tcPr>
+            <w:tcW w:type="dxa" w:w="680"/>
+            <w:tcMar>
+              <w:top w:type="dxa" w:w="80"/>
+              <w:left w:type="dxa" w:w="120"/>
+              <w:bottom w:type="dxa" w:w="80"/>
+              <w:right w:type="dxa" w:w="120"/>
+            </w:tcMar>
+          </w:tcPr>
+          <w:p>
+            <w:pPr>
+              <w:spacing w:after="0"/>
+            </w:pPr>
+            <w:r>
+              <w:rPr>
+                <w:rFonts w:ascii="Times New Roman" w:cs="Times New Roman" w:eastAsia="Times New Roman" w:hAnsi="Times New Roman"/>
+                <w:b w:val="false"/>
+                <w:bCs w:val="false"/>
+                <w:sz w:val="24"/>
+                <w:szCs w:val="24"/>
+              </w:rPr>
+              <w:t xml:space="preserve">15:30</w:t>
+            </w:r>
+          </w:p>
+        </w:tc>
+        <w:tc>
+          <w:tcPr>
+            <w:tcW w:type="dxa" w:w="680"/>
+            <w:tcMar>
+              <w:top w:type="dxa" w:w="80"/>
+              <w:left w:type="dxa" w:w="120"/>
+              <w:bottom w:type="dxa" w:w="80"/>
+              <w:right w:type="dxa" w:w="120"/>
+            </w:tcMar>
+          </w:tcPr>
+          <w:p>
+            <w:pPr>
+              <w:spacing w:after="0"/>
+            </w:pPr>
+            <w:r>
+              <w:rPr>
+                <w:rFonts w:ascii="Times New Roman" w:cs="Times New Roman" w:eastAsia="Times New Roman" w:hAnsi="Times New Roman"/>
+                <w:b w:val="false"/>
+                <w:bCs w:val="false"/>
+                <w:sz w:val="24"/>
+                <w:szCs w:val="24"/>
+              </w:rPr>
+              <w:t xml:space="preserve">16:50</w:t>
+            </w:r>
+          </w:p>
+        </w:tc>
+        <w:tc>
+          <w:tcPr>
+            <w:tcW w:type="dxa" w:w="1120"/>
+            <w:tcMar>
+              <w:top w:type="dxa" w:w="80"/>
+              <w:left w:type="dxa" w:w="120"/>
+              <w:bottom w:type="dxa" w:w="80"/>
+              <w:right w:type="dxa" w:w="120"/>
+            </w:tcMar>
+          </w:tcPr>
+          <w:p>
+            <w:pPr>
+              <w:spacing w:after="0"/>
+            </w:pPr>
+            <w:r>
+              <w:rPr>
+                <w:rFonts w:ascii="Times New Roman" w:cs="Times New Roman" w:eastAsia="Times New Roman" w:hAnsi="Times New Roman"/>
+                <w:b w:val="false"/>
+                <w:bCs w:val="false"/>
+                <w:sz w:val="24"/>
+                <w:szCs w:val="24"/>
+              </w:rPr>
+              <w:t xml:space="preserve">0:10</w:t>
+            </w:r>
+          </w:p>
+        </w:tc>
+        <w:tc>
+          <w:tcPr>
+            <w:tcW w:type="dxa" w:w="900"/>
+            <w:tcMar>
+              <w:top w:type="dxa" w:w="80"/>
+              <w:left w:type="dxa" w:w="120"/>
+              <w:bottom w:type="dxa" w:w="80"/>
+              <w:right w:type="dxa" w:w="120"/>
+            </w:tcMar>
+          </w:tcPr>
+          <w:p>
+            <w:pPr>
+              <w:spacing w:after="0"/>
+            </w:pPr>
+            <w:r>
+              <w:rPr>
+                <w:rFonts w:ascii="Times New Roman" w:cs="Times New Roman" w:eastAsia="Times New Roman" w:hAnsi="Times New Roman"/>
+                <w:b w:val="false"/>
+                <w:bCs w:val="false"/>
+                <w:sz w:val="24"/>
+                <w:szCs w:val="24"/>
+              </w:rPr>
+              <w:t xml:space="preserve">1:10</w:t>
+            </w:r>
+          </w:p>
+        </w:tc>
+        <w:tc>
+          <w:tcPr>
+            <w:tcW w:type="dxa" w:w="1280"/>
+            <w:tcMar>
+              <w:top w:type="dxa" w:w="80"/>
+              <w:left w:type="dxa" w:w="120"/>
+              <w:bottom w:type="dxa" w:w="80"/>
+              <w:right w:type="dxa" w:w="120"/>
+            </w:tcMar>
+          </w:tcPr>
+          <w:p>
+            <w:pPr>
+              <w:spacing w:after="0"/>
+            </w:pPr>
+            <w:r>
+              <w:rPr>
+                <w:rFonts w:ascii="Times New Roman" w:cs="Times New Roman" w:eastAsia="Times New Roman" w:hAnsi="Times New Roman"/>
+                <w:b w:val="false"/>
+                <w:bCs w:val="false"/>
+                <w:sz w:val="24"/>
+                <w:szCs w:val="24"/>
+              </w:rPr>
+              <w:t xml:space="preserve">Codificación</w:t>
+            </w:r>
+          </w:p>
+        </w:tc>
+        <w:tc>
+          <w:tcPr>
+            <w:tcW w:type="dxa" w:w="3800"/>
+            <w:tcMar>
+              <w:top w:type="dxa" w:w="80"/>
+              <w:left w:type="dxa" w:w="120"/>
+              <w:bottom w:type="dxa" w:w="80"/>
+              <w:right w:type="dxa" w:w="120"/>
+            </w:tcMar>
+          </w:tcPr>
+          <w:p>
+            <w:pPr>
+              <w:spacing w:after="0"/>
+            </w:pPr>
+            <w:r>
+              <w:rPr>
+                <w:rFonts w:ascii="Times New Roman" w:cs="Times New Roman" w:eastAsia="Times New Roman" w:hAnsi="Times New Roman"/>
+                <w:b w:val="false"/>
+                <w:bCs w:val="false"/>
+                <w:sz w:val="24"/>
+                <w:szCs w:val="24"/>
+              </w:rPr>
+              <w:t xml:space="preserve">Carga idempotente y reversible del contenido de demostración, y aceptación de las imágenes propias del sitio en los validadores.</w:t>
+            </w:r>
+          </w:p>
+        </w:tc>
+      </w:tr>
+      <w:tr>
+        <w:tc>
+          <w:tcPr>
+            <w:tcW w:type="dxa" w:w="900"/>
+            <w:tcMar>
+              <w:top w:type="dxa" w:w="80"/>
+              <w:left w:type="dxa" w:w="120"/>
+              <w:bottom w:type="dxa" w:w="80"/>
+              <w:right w:type="dxa" w:w="120"/>
+            </w:tcMar>
+          </w:tcPr>
+          <w:p>
+            <w:pPr>
+              <w:spacing w:after="0"/>
+            </w:pPr>
+            <w:r>
+              <w:rPr>
+                <w:rFonts w:ascii="Times New Roman" w:cs="Times New Roman" w:eastAsia="Times New Roman" w:hAnsi="Times New Roman"/>
+                <w:b w:val="false"/>
+                <w:bCs w:val="false"/>
+                <w:sz w:val="24"/>
+                <w:szCs w:val="24"/>
+              </w:rPr>
+              <w:t xml:space="preserve">08/10/2026</w:t>
+            </w:r>
+          </w:p>
+        </w:tc>
+        <w:tc>
+          <w:tcPr>
+            <w:tcW w:type="dxa" w:w="680"/>
+            <w:tcMar>
+              <w:top w:type="dxa" w:w="80"/>
+              <w:left w:type="dxa" w:w="120"/>
+              <w:bottom w:type="dxa" w:w="80"/>
+              <w:right w:type="dxa" w:w="120"/>
+            </w:tcMar>
+          </w:tcPr>
+          <w:p>
+            <w:pPr>
+              <w:spacing w:after="0"/>
+            </w:pPr>
+            <w:r>
+              <w:rPr>
+                <w:rFonts w:ascii="Times New Roman" w:cs="Times New Roman" w:eastAsia="Times New Roman" w:hAnsi="Times New Roman"/>
+                <w:b w:val="false"/>
+                <w:bCs w:val="false"/>
+                <w:sz w:val="24"/>
+                <w:szCs w:val="24"/>
+              </w:rPr>
+              <w:t xml:space="preserve">18:10</w:t>
+            </w:r>
+          </w:p>
+        </w:tc>
+        <w:tc>
+          <w:tcPr>
+            <w:tcW w:type="dxa" w:w="680"/>
+            <w:tcMar>
+              <w:top w:type="dxa" w:w="80"/>
+              <w:left w:type="dxa" w:w="120"/>
+              <w:bottom w:type="dxa" w:w="80"/>
+              <w:right w:type="dxa" w:w="120"/>
+            </w:tcMar>
+          </w:tcPr>
+          <w:p>
+            <w:pPr>
+              <w:spacing w:after="0"/>
+            </w:pPr>
+            <w:r>
+              <w:rPr>
+                <w:rFonts w:ascii="Times New Roman" w:cs="Times New Roman" w:eastAsia="Times New Roman" w:hAnsi="Times New Roman"/>
+                <w:b w:val="false"/>
+                <w:bCs w:val="false"/>
+                <w:sz w:val="24"/>
+                <w:szCs w:val="24"/>
+              </w:rPr>
+              <w:t xml:space="preserve">18:55</w:t>
+            </w:r>
+          </w:p>
+        </w:tc>
+        <w:tc>
+          <w:tcPr>
+            <w:tcW w:type="dxa" w:w="1120"/>
+            <w:tcMar>
+              <w:top w:type="dxa" w:w="80"/>
+              <w:left w:type="dxa" w:w="120"/>
+              <w:bottom w:type="dxa" w:w="80"/>
+              <w:right w:type="dxa" w:w="120"/>
+            </w:tcMar>
+          </w:tcPr>
+          <w:p>
+            <w:pPr>
+              <w:spacing w:after="0"/>
+            </w:pPr>
+            <w:r>
+              <w:rPr>
+                <w:rFonts w:ascii="Times New Roman" w:cs="Times New Roman" w:eastAsia="Times New Roman" w:hAnsi="Times New Roman"/>
+                <w:b w:val="false"/>
+                <w:bCs w:val="false"/>
+                <w:sz w:val="24"/>
+                <w:szCs w:val="24"/>
+              </w:rPr>
+              <w:t xml:space="preserve">0:05</w:t>
+            </w:r>
+          </w:p>
+        </w:tc>
+        <w:tc>
+          <w:tcPr>
+            <w:tcW w:type="dxa" w:w="900"/>
+            <w:tcMar>
+              <w:top w:type="dxa" w:w="80"/>
+              <w:left w:type="dxa" w:w="120"/>
+              <w:bottom w:type="dxa" w:w="80"/>
+              <w:right w:type="dxa" w:w="120"/>
+            </w:tcMar>
+          </w:tcPr>
+          <w:p>
+            <w:pPr>
+              <w:spacing w:after="0"/>
+            </w:pPr>
+            <w:r>
+              <w:rPr>
+                <w:rFonts w:ascii="Times New Roman" w:cs="Times New Roman" w:eastAsia="Times New Roman" w:hAnsi="Times New Roman"/>
+                <w:b w:val="false"/>
+                <w:bCs w:val="false"/>
+                <w:sz w:val="24"/>
+                <w:szCs w:val="24"/>
+              </w:rPr>
+              <w:t xml:space="preserve">0:40</w:t>
+            </w:r>
+          </w:p>
+        </w:tc>
+        <w:tc>
+          <w:tcPr>
+            <w:tcW w:type="dxa" w:w="1280"/>
+            <w:tcMar>
+              <w:top w:type="dxa" w:w="80"/>
+              <w:left w:type="dxa" w:w="120"/>
+              <w:bottom w:type="dxa" w:w="80"/>
+              <w:right w:type="dxa" w:w="120"/>
+            </w:tcMar>
+          </w:tcPr>
+          <w:p>
+            <w:pPr>
+              <w:spacing w:after="0"/>
+            </w:pPr>
+            <w:r>
+              <w:rPr>
+                <w:rFonts w:ascii="Times New Roman" w:cs="Times New Roman" w:eastAsia="Times New Roman" w:hAnsi="Times New Roman"/>
+                <w:b w:val="false"/>
+                <w:bCs w:val="false"/>
+                <w:sz w:val="24"/>
+                <w:szCs w:val="24"/>
+              </w:rPr>
+              <w:t xml:space="preserve">Despliegue</w:t>
+            </w:r>
+          </w:p>
+        </w:tc>
+        <w:tc>
+          <w:tcPr>
+            <w:tcW w:type="dxa" w:w="3800"/>
+            <w:tcMar>
+              <w:top w:type="dxa" w:w="80"/>
+              <w:left w:type="dxa" w:w="120"/>
+              <w:bottom w:type="dxa" w:w="80"/>
+              <w:right w:type="dxa" w:w="120"/>
+            </w:tcMar>
+          </w:tcPr>
+          <w:p>
+            <w:pPr>
+              <w:spacing w:after="0"/>
+            </w:pPr>
+            <w:r>
+              <w:rPr>
+                <w:rFonts w:ascii="Times New Roman" w:cs="Times New Roman" w:eastAsia="Times New Roman" w:hAnsi="Times New Roman"/>
+                <w:b w:val="false"/>
+                <w:bCs w:val="false"/>
+                <w:sz w:val="24"/>
+                <w:szCs w:val="24"/>
+              </w:rPr>
+              <w:t xml:space="preserve">Carga del contenido de demostración en Railway y verificación de la portada, los listados y el calendario en producción.</w:t>
+            </w:r>
+          </w:p>
+        </w:tc>
+      </w:tr>
+      <w:tr>
+        <w:tc>
+          <w:tcPr>
+            <w:tcW w:type="dxa" w:w="900"/>
+            <w:tcMar>
+              <w:top w:type="dxa" w:w="80"/>
+              <w:left w:type="dxa" w:w="120"/>
+              <w:bottom w:type="dxa" w:w="80"/>
+              <w:right w:type="dxa" w:w="120"/>
+            </w:tcMar>
+          </w:tcPr>
+          <w:p>
+            <w:pPr>
+              <w:spacing w:after="0"/>
+            </w:pPr>
+            <w:r>
+              <w:rPr>
+                <w:rFonts w:ascii="Times New Roman" w:cs="Times New Roman" w:eastAsia="Times New Roman" w:hAnsi="Times New Roman"/>
+                <w:b w:val="false"/>
+                <w:bCs w:val="false"/>
+                <w:sz w:val="24"/>
+                <w:szCs w:val="24"/>
+              </w:rPr>
+              <w:t xml:space="preserve">10/10/2026</w:t>
+            </w:r>
+          </w:p>
+        </w:tc>
+        <w:tc>
+          <w:tcPr>
+            <w:tcW w:type="dxa" w:w="680"/>
+            <w:tcMar>
+              <w:top w:type="dxa" w:w="80"/>
+              <w:left w:type="dxa" w:w="120"/>
+              <w:bottom w:type="dxa" w:w="80"/>
+              <w:right w:type="dxa" w:w="120"/>
+            </w:tcMar>
+          </w:tcPr>
+          <w:p>
+            <w:pPr>
+              <w:spacing w:after="0"/>
+            </w:pPr>
+            <w:r>
+              <w:rPr>
+                <w:rFonts w:ascii="Times New Roman" w:cs="Times New Roman" w:eastAsia="Times New Roman" w:hAnsi="Times New Roman"/>
+                <w:b w:val="false"/>
+                <w:bCs w:val="false"/>
+                <w:sz w:val="24"/>
+                <w:szCs w:val="24"/>
+              </w:rPr>
+              <w:t xml:space="preserve">10:00</w:t>
+            </w:r>
+          </w:p>
+        </w:tc>
+        <w:tc>
+          <w:tcPr>
+            <w:tcW w:type="dxa" w:w="680"/>
+            <w:tcMar>
+              <w:top w:type="dxa" w:w="80"/>
+              <w:left w:type="dxa" w:w="120"/>
+              <w:bottom w:type="dxa" w:w="80"/>
+              <w:right w:type="dxa" w:w="120"/>
+            </w:tcMar>
+          </w:tcPr>
+          <w:p>
+            <w:pPr>
+              <w:spacing w:after="0"/>
+            </w:pPr>
+            <w:r>
+              <w:rPr>
+                <w:rFonts w:ascii="Times New Roman" w:cs="Times New Roman" w:eastAsia="Times New Roman" w:hAnsi="Times New Roman"/>
+                <w:b w:val="false"/>
+                <w:bCs w:val="false"/>
+                <w:sz w:val="24"/>
+                <w:szCs w:val="24"/>
+              </w:rPr>
+              <w:t xml:space="preserve">11:35</w:t>
+            </w:r>
+          </w:p>
+        </w:tc>
+        <w:tc>
+          <w:tcPr>
+            <w:tcW w:type="dxa" w:w="1120"/>
+            <w:tcMar>
+              <w:top w:type="dxa" w:w="80"/>
+              <w:left w:type="dxa" w:w="120"/>
+              <w:bottom w:type="dxa" w:w="80"/>
+              <w:right w:type="dxa" w:w="120"/>
+            </w:tcMar>
+          </w:tcPr>
+          <w:p>
+            <w:pPr>
+              <w:spacing w:after="0"/>
+            </w:pPr>
+            <w:r>
+              <w:rPr>
+                <w:rFonts w:ascii="Times New Roman" w:cs="Times New Roman" w:eastAsia="Times New Roman" w:hAnsi="Times New Roman"/>
+                <w:b w:val="false"/>
+                <w:bCs w:val="false"/>
+                <w:sz w:val="24"/>
+                <w:szCs w:val="24"/>
+              </w:rPr>
+              <w:t xml:space="preserve">0:10</w:t>
+            </w:r>
+          </w:p>
+        </w:tc>
+        <w:tc>
+          <w:tcPr>
+            <w:tcW w:type="dxa" w:w="900"/>
+            <w:tcMar>
+              <w:top w:type="dxa" w:w="80"/>
+              <w:left w:type="dxa" w:w="120"/>
+              <w:bottom w:type="dxa" w:w="80"/>
+              <w:right w:type="dxa" w:w="120"/>
+            </w:tcMar>
+          </w:tcPr>
+          <w:p>
+            <w:pPr>
+              <w:spacing w:after="0"/>
+            </w:pPr>
+            <w:r>
+              <w:rPr>
+                <w:rFonts w:ascii="Times New Roman" w:cs="Times New Roman" w:eastAsia="Times New Roman" w:hAnsi="Times New Roman"/>
+                <w:b w:val="false"/>
+                <w:bCs w:val="false"/>
+                <w:sz w:val="24"/>
+                <w:szCs w:val="24"/>
+              </w:rPr>
+              <w:t xml:space="preserve">1:25</w:t>
+            </w:r>
+          </w:p>
+        </w:tc>
+        <w:tc>
+          <w:tcPr>
+            <w:tcW w:type="dxa" w:w="1280"/>
+            <w:tcMar>
+              <w:top w:type="dxa" w:w="80"/>
+              <w:left w:type="dxa" w:w="120"/>
+              <w:bottom w:type="dxa" w:w="80"/>
+              <w:right w:type="dxa" w:w="120"/>
+            </w:tcMar>
+          </w:tcPr>
+          <w:p>
+            <w:pPr>
+              <w:spacing w:after="0"/>
+            </w:pPr>
+            <w:r>
+              <w:rPr>
+                <w:rFonts w:ascii="Times New Roman" w:cs="Times New Roman" w:eastAsia="Times New Roman" w:hAnsi="Times New Roman"/>
+                <w:b w:val="false"/>
+                <w:bCs w:val="false"/>
+                <w:sz w:val="24"/>
+                <w:szCs w:val="24"/>
+              </w:rPr>
+              <w:t xml:space="preserve">Documentación</w:t>
+            </w:r>
+          </w:p>
+        </w:tc>
+        <w:tc>
+          <w:tcPr>
+            <w:tcW w:type="dxa" w:w="3800"/>
+            <w:tcMar>
+              <w:top w:type="dxa" w:w="80"/>
+              <w:left w:type="dxa" w:w="120"/>
+              <w:bottom w:type="dxa" w:w="80"/>
+              <w:right w:type="dxa" w:w="120"/>
+            </w:tcMar>
+          </w:tcPr>
+          <w:p>
+            <w:pPr>
+              <w:spacing w:after="0"/>
+            </w:pPr>
+            <w:r>
+              <w:rPr>
+                <w:rFonts w:ascii="Times New Roman" w:cs="Times New Roman" w:eastAsia="Times New Roman" w:hAnsi="Times New Roman"/>
+                <w:b w:val="false"/>
+                <w:bCs w:val="false"/>
+                <w:sz w:val="24"/>
+                <w:szCs w:val="24"/>
+              </w:rPr>
+              <w:t xml:space="preserve">Actualización del documento de desarrollo y del registro de tiempos del Sprint 3 con los ajustes finales.</w:t>
+            </w:r>
+          </w:p>
+        </w:tc>
+      </w:tr>
     </w:tbl>
     <w:p>
       <w:pPr>
@@ -6808,7 +8494,7 @@
                 <w:sz w:val="24"/>
                 <w:szCs w:val="24"/>
               </w:rPr>
-              <w:t xml:space="preserve">Documentación del sprint</w:t>
+              <w:t xml:space="preserve">Ajustes finales del sprint</w:t>
             </w:r>
           </w:p>
         </w:tc>
@@ -6834,7 +8520,7 @@
                 <w:sz w:val="24"/>
                 <w:szCs w:val="24"/>
               </w:rPr>
-              <w:t xml:space="preserve">3:05</w:t>
+              <w:t xml:space="preserve">4:45</w:t>
             </w:r>
           </w:p>
         </w:tc>
@@ -6860,7 +8546,7 @@
                 <w:sz w:val="24"/>
                 <w:szCs w:val="24"/>
               </w:rPr>
-              <w:t xml:space="preserve">3.1</w:t>
+              <w:t xml:space="preserve">4.8</w:t>
             </w:r>
           </w:p>
         </w:tc>
@@ -6888,6 +8574,86 @@
                 <w:sz w:val="24"/>
                 <w:szCs w:val="24"/>
               </w:rPr>
+              <w:t xml:space="preserve">Documentación del sprint</w:t>
+            </w:r>
+          </w:p>
+        </w:tc>
+        <w:tc>
+          <w:tcPr>
+            <w:tcW w:type="dxa" w:w="1900"/>
+            <w:tcMar>
+              <w:top w:type="dxa" w:w="80"/>
+              <w:left w:type="dxa" w:w="120"/>
+              <w:bottom w:type="dxa" w:w="80"/>
+              <w:right w:type="dxa" w:w="120"/>
+            </w:tcMar>
+          </w:tcPr>
+          <w:p>
+            <w:pPr>
+              <w:spacing w:after="0"/>
+            </w:pPr>
+            <w:r>
+              <w:rPr>
+                <w:rFonts w:ascii="Times New Roman" w:cs="Times New Roman" w:eastAsia="Times New Roman" w:hAnsi="Times New Roman"/>
+                <w:b w:val="false"/>
+                <w:bCs w:val="false"/>
+                <w:sz w:val="24"/>
+                <w:szCs w:val="24"/>
+              </w:rPr>
+              <w:t xml:space="preserve">4:30</w:t>
+            </w:r>
+          </w:p>
+        </w:tc>
+        <w:tc>
+          <w:tcPr>
+            <w:tcW w:type="dxa" w:w="1900"/>
+            <w:tcMar>
+              <w:top w:type="dxa" w:w="80"/>
+              <w:left w:type="dxa" w:w="120"/>
+              <w:bottom w:type="dxa" w:w="80"/>
+              <w:right w:type="dxa" w:w="120"/>
+            </w:tcMar>
+          </w:tcPr>
+          <w:p>
+            <w:pPr>
+              <w:spacing w:after="0"/>
+            </w:pPr>
+            <w:r>
+              <w:rPr>
+                <w:rFonts w:ascii="Times New Roman" w:cs="Times New Roman" w:eastAsia="Times New Roman" w:hAnsi="Times New Roman"/>
+                <w:b w:val="false"/>
+                <w:bCs w:val="false"/>
+                <w:sz w:val="24"/>
+                <w:szCs w:val="24"/>
+              </w:rPr>
+              <w:t xml:space="preserve">4.5</w:t>
+            </w:r>
+          </w:p>
+        </w:tc>
+      </w:tr>
+      <w:tr>
+        <w:tc>
+          <w:tcPr>
+            <w:tcW w:type="dxa" w:w="5560"/>
+            <w:tcMar>
+              <w:top w:type="dxa" w:w="80"/>
+              <w:left w:type="dxa" w:w="120"/>
+              <w:bottom w:type="dxa" w:w="80"/>
+              <w:right w:type="dxa" w:w="120"/>
+            </w:tcMar>
+          </w:tcPr>
+          <w:p>
+            <w:pPr>
+              <w:spacing w:after="0"/>
+            </w:pPr>
+            <w:r>
+              <w:rPr>
+                <w:rFonts w:ascii="Times New Roman" w:cs="Times New Roman" w:eastAsia="Times New Roman" w:hAnsi="Times New Roman"/>
+                <w:b w:val="false"/>
+                <w:bCs w:val="false"/>
+                <w:sz w:val="24"/>
+                <w:szCs w:val="24"/>
+              </w:rPr>
               <w:t xml:space="preserve">Total</w:t>
             </w:r>
           </w:p>
@@ -6914,7 +8680,7 @@
                 <w:sz w:val="24"/>
                 <w:szCs w:val="24"/>
               </w:rPr>
-              <w:t xml:space="preserve">18:00</w:t>
+              <w:t xml:space="preserve">24:10</w:t>
             </w:r>
           </w:p>
         </w:tc>
@@ -6940,7 +8706,7 @@
                 <w:sz w:val="24"/>
                 <w:szCs w:val="24"/>
               </w:rPr>
-              <w:t xml:space="preserve">18.0</w:t>
+              <w:t xml:space="preserve">24.2</w:t>
             </w:r>
           </w:p>
         </w:tc>
@@ -6960,7 +8726,7 @@
           <w:sz w:val="30"/>
           <w:szCs w:val="30"/>
         </w:rPr>
-        <w:t xml:space="preserve">10.2. Juan Gabriel Gualim Molina - 24852</w:t>
+        <w:t xml:space="preserve">11.2. Juan Gabriel Gualim Molina - 24852</w:t>
       </w:r>
     </w:p>
     <w:p>
@@ -9575,6 +11341,1110 @@
           </w:p>
         </w:tc>
       </w:tr>
+      <w:tr>
+        <w:tc>
+          <w:tcPr>
+            <w:tcW w:type="dxa" w:w="900"/>
+            <w:tcMar>
+              <w:top w:type="dxa" w:w="80"/>
+              <w:left w:type="dxa" w:w="120"/>
+              <w:bottom w:type="dxa" w:w="80"/>
+              <w:right w:type="dxa" w:w="120"/>
+            </w:tcMar>
+          </w:tcPr>
+          <w:p>
+            <w:pPr>
+              <w:spacing w:after="0"/>
+            </w:pPr>
+            <w:r>
+              <w:rPr>
+                <w:rFonts w:ascii="Times New Roman" w:cs="Times New Roman" w:eastAsia="Times New Roman" w:hAnsi="Times New Roman"/>
+                <w:b w:val="false"/>
+                <w:bCs w:val="false"/>
+                <w:sz w:val="24"/>
+                <w:szCs w:val="24"/>
+              </w:rPr>
+              <w:t xml:space="preserve">07/10/2026</w:t>
+            </w:r>
+          </w:p>
+        </w:tc>
+        <w:tc>
+          <w:tcPr>
+            <w:tcW w:type="dxa" w:w="680"/>
+            <w:tcMar>
+              <w:top w:type="dxa" w:w="80"/>
+              <w:left w:type="dxa" w:w="120"/>
+              <w:bottom w:type="dxa" w:w="80"/>
+              <w:right w:type="dxa" w:w="120"/>
+            </w:tcMar>
+          </w:tcPr>
+          <w:p>
+            <w:pPr>
+              <w:spacing w:after="0"/>
+            </w:pPr>
+            <w:r>
+              <w:rPr>
+                <w:rFonts w:ascii="Times New Roman" w:cs="Times New Roman" w:eastAsia="Times New Roman" w:hAnsi="Times New Roman"/>
+                <w:b w:val="false"/>
+                <w:bCs w:val="false"/>
+                <w:sz w:val="24"/>
+                <w:szCs w:val="24"/>
+              </w:rPr>
+              <w:t xml:space="preserve">22:10</w:t>
+            </w:r>
+          </w:p>
+        </w:tc>
+        <w:tc>
+          <w:tcPr>
+            <w:tcW w:type="dxa" w:w="680"/>
+            <w:tcMar>
+              <w:top w:type="dxa" w:w="80"/>
+              <w:left w:type="dxa" w:w="120"/>
+              <w:bottom w:type="dxa" w:w="80"/>
+              <w:right w:type="dxa" w:w="120"/>
+            </w:tcMar>
+          </w:tcPr>
+          <w:p>
+            <w:pPr>
+              <w:spacing w:after="0"/>
+            </w:pPr>
+            <w:r>
+              <w:rPr>
+                <w:rFonts w:ascii="Times New Roman" w:cs="Times New Roman" w:eastAsia="Times New Roman" w:hAnsi="Times New Roman"/>
+                <w:b w:val="false"/>
+                <w:bCs w:val="false"/>
+                <w:sz w:val="24"/>
+                <w:szCs w:val="24"/>
+              </w:rPr>
+              <w:t xml:space="preserve">23:35</w:t>
+            </w:r>
+          </w:p>
+        </w:tc>
+        <w:tc>
+          <w:tcPr>
+            <w:tcW w:type="dxa" w:w="1120"/>
+            <w:tcMar>
+              <w:top w:type="dxa" w:w="80"/>
+              <w:left w:type="dxa" w:w="120"/>
+              <w:bottom w:type="dxa" w:w="80"/>
+              <w:right w:type="dxa" w:w="120"/>
+            </w:tcMar>
+          </w:tcPr>
+          <w:p>
+            <w:pPr>
+              <w:spacing w:after="0"/>
+            </w:pPr>
+            <w:r>
+              <w:rPr>
+                <w:rFonts w:ascii="Times New Roman" w:cs="Times New Roman" w:eastAsia="Times New Roman" w:hAnsi="Times New Roman"/>
+                <w:b w:val="false"/>
+                <w:bCs w:val="false"/>
+                <w:sz w:val="24"/>
+                <w:szCs w:val="24"/>
+              </w:rPr>
+              <w:t xml:space="preserve">0:10</w:t>
+            </w:r>
+          </w:p>
+        </w:tc>
+        <w:tc>
+          <w:tcPr>
+            <w:tcW w:type="dxa" w:w="900"/>
+            <w:tcMar>
+              <w:top w:type="dxa" w:w="80"/>
+              <w:left w:type="dxa" w:w="120"/>
+              <w:bottom w:type="dxa" w:w="80"/>
+              <w:right w:type="dxa" w:w="120"/>
+            </w:tcMar>
+          </w:tcPr>
+          <w:p>
+            <w:pPr>
+              <w:spacing w:after="0"/>
+            </w:pPr>
+            <w:r>
+              <w:rPr>
+                <w:rFonts w:ascii="Times New Roman" w:cs="Times New Roman" w:eastAsia="Times New Roman" w:hAnsi="Times New Roman"/>
+                <w:b w:val="false"/>
+                <w:bCs w:val="false"/>
+                <w:sz w:val="24"/>
+                <w:szCs w:val="24"/>
+              </w:rPr>
+              <w:t xml:space="preserve">1:15</w:t>
+            </w:r>
+          </w:p>
+        </w:tc>
+        <w:tc>
+          <w:tcPr>
+            <w:tcW w:type="dxa" w:w="1280"/>
+            <w:tcMar>
+              <w:top w:type="dxa" w:w="80"/>
+              <w:left w:type="dxa" w:w="120"/>
+              <w:bottom w:type="dxa" w:w="80"/>
+              <w:right w:type="dxa" w:w="120"/>
+            </w:tcMar>
+          </w:tcPr>
+          <w:p>
+            <w:pPr>
+              <w:spacing w:after="0"/>
+            </w:pPr>
+            <w:r>
+              <w:rPr>
+                <w:rFonts w:ascii="Times New Roman" w:cs="Times New Roman" w:eastAsia="Times New Roman" w:hAnsi="Times New Roman"/>
+                <w:b w:val="false"/>
+                <w:bCs w:val="false"/>
+                <w:sz w:val="24"/>
+                <w:szCs w:val="24"/>
+              </w:rPr>
+              <w:t xml:space="preserve">Diseño y codificación</w:t>
+            </w:r>
+          </w:p>
+        </w:tc>
+        <w:tc>
+          <w:tcPr>
+            <w:tcW w:type="dxa" w:w="3800"/>
+            <w:tcMar>
+              <w:top w:type="dxa" w:w="80"/>
+              <w:left w:type="dxa" w:w="120"/>
+              <w:bottom w:type="dxa" w:w="80"/>
+              <w:right w:type="dxa" w:w="120"/>
+            </w:tcMar>
+          </w:tcPr>
+          <w:p>
+            <w:pPr>
+              <w:spacing w:after="0"/>
+            </w:pPr>
+            <w:r>
+              <w:rPr>
+                <w:rFonts w:ascii="Times New Roman" w:cs="Times New Roman" w:eastAsia="Times New Roman" w:hAnsi="Times New Roman"/>
+                <w:b w:val="false"/>
+                <w:bCs w:val="false"/>
+                <w:sz w:val="24"/>
+                <w:szCs w:val="24"/>
+              </w:rPr>
+              <w:t xml:space="preserve">Asterisco rojo en los campos obligatorios de todos los formularios del sitio, con un componente de etiqueta compartido.</w:t>
+            </w:r>
+          </w:p>
+        </w:tc>
+      </w:tr>
+      <w:tr>
+        <w:tc>
+          <w:tcPr>
+            <w:tcW w:type="dxa" w:w="900"/>
+            <w:tcMar>
+              <w:top w:type="dxa" w:w="80"/>
+              <w:left w:type="dxa" w:w="120"/>
+              <w:bottom w:type="dxa" w:w="80"/>
+              <w:right w:type="dxa" w:w="120"/>
+            </w:tcMar>
+          </w:tcPr>
+          <w:p>
+            <w:pPr>
+              <w:spacing w:after="0"/>
+            </w:pPr>
+            <w:r>
+              <w:rPr>
+                <w:rFonts w:ascii="Times New Roman" w:cs="Times New Roman" w:eastAsia="Times New Roman" w:hAnsi="Times New Roman"/>
+                <w:b w:val="false"/>
+                <w:bCs w:val="false"/>
+                <w:sz w:val="24"/>
+                <w:szCs w:val="24"/>
+              </w:rPr>
+              <w:t xml:space="preserve">08/10/2026</w:t>
+            </w:r>
+          </w:p>
+        </w:tc>
+        <w:tc>
+          <w:tcPr>
+            <w:tcW w:type="dxa" w:w="680"/>
+            <w:tcMar>
+              <w:top w:type="dxa" w:w="80"/>
+              <w:left w:type="dxa" w:w="120"/>
+              <w:bottom w:type="dxa" w:w="80"/>
+              <w:right w:type="dxa" w:w="120"/>
+            </w:tcMar>
+          </w:tcPr>
+          <w:p>
+            <w:pPr>
+              <w:spacing w:after="0"/>
+            </w:pPr>
+            <w:r>
+              <w:rPr>
+                <w:rFonts w:ascii="Times New Roman" w:cs="Times New Roman" w:eastAsia="Times New Roman" w:hAnsi="Times New Roman"/>
+                <w:b w:val="false"/>
+                <w:bCs w:val="false"/>
+                <w:sz w:val="24"/>
+                <w:szCs w:val="24"/>
+              </w:rPr>
+              <w:t xml:space="preserve">01:00</w:t>
+            </w:r>
+          </w:p>
+        </w:tc>
+        <w:tc>
+          <w:tcPr>
+            <w:tcW w:type="dxa" w:w="680"/>
+            <w:tcMar>
+              <w:top w:type="dxa" w:w="80"/>
+              <w:left w:type="dxa" w:w="120"/>
+              <w:bottom w:type="dxa" w:w="80"/>
+              <w:right w:type="dxa" w:w="120"/>
+            </w:tcMar>
+          </w:tcPr>
+          <w:p>
+            <w:pPr>
+              <w:spacing w:after="0"/>
+            </w:pPr>
+            <w:r>
+              <w:rPr>
+                <w:rFonts w:ascii="Times New Roman" w:cs="Times New Roman" w:eastAsia="Times New Roman" w:hAnsi="Times New Roman"/>
+                <w:b w:val="false"/>
+                <w:bCs w:val="false"/>
+                <w:sz w:val="24"/>
+                <w:szCs w:val="24"/>
+              </w:rPr>
+              <w:t xml:space="preserve">02:20</w:t>
+            </w:r>
+          </w:p>
+        </w:tc>
+        <w:tc>
+          <w:tcPr>
+            <w:tcW w:type="dxa" w:w="1120"/>
+            <w:tcMar>
+              <w:top w:type="dxa" w:w="80"/>
+              <w:left w:type="dxa" w:w="120"/>
+              <w:bottom w:type="dxa" w:w="80"/>
+              <w:right w:type="dxa" w:w="120"/>
+            </w:tcMar>
+          </w:tcPr>
+          <w:p>
+            <w:pPr>
+              <w:spacing w:after="0"/>
+            </w:pPr>
+            <w:r>
+              <w:rPr>
+                <w:rFonts w:ascii="Times New Roman" w:cs="Times New Roman" w:eastAsia="Times New Roman" w:hAnsi="Times New Roman"/>
+                <w:b w:val="false"/>
+                <w:bCs w:val="false"/>
+                <w:sz w:val="24"/>
+                <w:szCs w:val="24"/>
+              </w:rPr>
+              <w:t xml:space="preserve">0:10</w:t>
+            </w:r>
+          </w:p>
+        </w:tc>
+        <w:tc>
+          <w:tcPr>
+            <w:tcW w:type="dxa" w:w="900"/>
+            <w:tcMar>
+              <w:top w:type="dxa" w:w="80"/>
+              <w:left w:type="dxa" w:w="120"/>
+              <w:bottom w:type="dxa" w:w="80"/>
+              <w:right w:type="dxa" w:w="120"/>
+            </w:tcMar>
+          </w:tcPr>
+          <w:p>
+            <w:pPr>
+              <w:spacing w:after="0"/>
+            </w:pPr>
+            <w:r>
+              <w:rPr>
+                <w:rFonts w:ascii="Times New Roman" w:cs="Times New Roman" w:eastAsia="Times New Roman" w:hAnsi="Times New Roman"/>
+                <w:b w:val="false"/>
+                <w:bCs w:val="false"/>
+                <w:sz w:val="24"/>
+                <w:szCs w:val="24"/>
+              </w:rPr>
+              <w:t xml:space="preserve">1:10</w:t>
+            </w:r>
+          </w:p>
+        </w:tc>
+        <w:tc>
+          <w:tcPr>
+            <w:tcW w:type="dxa" w:w="1280"/>
+            <w:tcMar>
+              <w:top w:type="dxa" w:w="80"/>
+              <w:left w:type="dxa" w:w="120"/>
+              <w:bottom w:type="dxa" w:w="80"/>
+              <w:right w:type="dxa" w:w="120"/>
+            </w:tcMar>
+          </w:tcPr>
+          <w:p>
+            <w:pPr>
+              <w:spacing w:after="0"/>
+            </w:pPr>
+            <w:r>
+              <w:rPr>
+                <w:rFonts w:ascii="Times New Roman" w:cs="Times New Roman" w:eastAsia="Times New Roman" w:hAnsi="Times New Roman"/>
+                <w:b w:val="false"/>
+                <w:bCs w:val="false"/>
+                <w:sz w:val="24"/>
+                <w:szCs w:val="24"/>
+              </w:rPr>
+              <w:t xml:space="preserve">Diseño y codificación</w:t>
+            </w:r>
+          </w:p>
+        </w:tc>
+        <w:tc>
+          <w:tcPr>
+            <w:tcW w:type="dxa" w:w="3800"/>
+            <w:tcMar>
+              <w:top w:type="dxa" w:w="80"/>
+              <w:left w:type="dxa" w:w="120"/>
+              <w:bottom w:type="dxa" w:w="80"/>
+              <w:right w:type="dxa" w:w="120"/>
+            </w:tcMar>
+          </w:tcPr>
+          <w:p>
+            <w:pPr>
+              <w:spacing w:after="0"/>
+            </w:pPr>
+            <w:r>
+              <w:rPr>
+                <w:rFonts w:ascii="Times New Roman" w:cs="Times New Roman" w:eastAsia="Times New Roman" w:hAnsi="Times New Roman"/>
+                <w:b w:val="false"/>
+                <w:bCs w:val="false"/>
+                <w:sz w:val="24"/>
+                <w:szCs w:val="24"/>
+              </w:rPr>
+              <w:t xml:space="preserve">Campos de siglas y nombre completo en el formulario de asociaciones. Tarjetas de asociaciones y clubes con la estructura de las de eventos.</w:t>
+            </w:r>
+          </w:p>
+        </w:tc>
+      </w:tr>
+      <w:tr>
+        <w:tc>
+          <w:tcPr>
+            <w:tcW w:type="dxa" w:w="900"/>
+            <w:tcMar>
+              <w:top w:type="dxa" w:w="80"/>
+              <w:left w:type="dxa" w:w="120"/>
+              <w:bottom w:type="dxa" w:w="80"/>
+              <w:right w:type="dxa" w:w="120"/>
+            </w:tcMar>
+          </w:tcPr>
+          <w:p>
+            <w:pPr>
+              <w:spacing w:after="0"/>
+            </w:pPr>
+            <w:r>
+              <w:rPr>
+                <w:rFonts w:ascii="Times New Roman" w:cs="Times New Roman" w:eastAsia="Times New Roman" w:hAnsi="Times New Roman"/>
+                <w:b w:val="false"/>
+                <w:bCs w:val="false"/>
+                <w:sz w:val="24"/>
+                <w:szCs w:val="24"/>
+              </w:rPr>
+              <w:t xml:space="preserve">08/10/2026</w:t>
+            </w:r>
+          </w:p>
+        </w:tc>
+        <w:tc>
+          <w:tcPr>
+            <w:tcW w:type="dxa" w:w="680"/>
+            <w:tcMar>
+              <w:top w:type="dxa" w:w="80"/>
+              <w:left w:type="dxa" w:w="120"/>
+              <w:bottom w:type="dxa" w:w="80"/>
+              <w:right w:type="dxa" w:w="120"/>
+            </w:tcMar>
+          </w:tcPr>
+          <w:p>
+            <w:pPr>
+              <w:spacing w:after="0"/>
+            </w:pPr>
+            <w:r>
+              <w:rPr>
+                <w:rFonts w:ascii="Times New Roman" w:cs="Times New Roman" w:eastAsia="Times New Roman" w:hAnsi="Times New Roman"/>
+                <w:b w:val="false"/>
+                <w:bCs w:val="false"/>
+                <w:sz w:val="24"/>
+                <w:szCs w:val="24"/>
+              </w:rPr>
+              <w:t xml:space="preserve">10:30</w:t>
+            </w:r>
+          </w:p>
+        </w:tc>
+        <w:tc>
+          <w:tcPr>
+            <w:tcW w:type="dxa" w:w="680"/>
+            <w:tcMar>
+              <w:top w:type="dxa" w:w="80"/>
+              <w:left w:type="dxa" w:w="120"/>
+              <w:bottom w:type="dxa" w:w="80"/>
+              <w:right w:type="dxa" w:w="120"/>
+            </w:tcMar>
+          </w:tcPr>
+          <w:p>
+            <w:pPr>
+              <w:spacing w:after="0"/>
+            </w:pPr>
+            <w:r>
+              <w:rPr>
+                <w:rFonts w:ascii="Times New Roman" w:cs="Times New Roman" w:eastAsia="Times New Roman" w:hAnsi="Times New Roman"/>
+                <w:b w:val="false"/>
+                <w:bCs w:val="false"/>
+                <w:sz w:val="24"/>
+                <w:szCs w:val="24"/>
+              </w:rPr>
+              <w:t xml:space="preserve">11:05</w:t>
+            </w:r>
+          </w:p>
+        </w:tc>
+        <w:tc>
+          <w:tcPr>
+            <w:tcW w:type="dxa" w:w="1120"/>
+            <w:tcMar>
+              <w:top w:type="dxa" w:w="80"/>
+              <w:left w:type="dxa" w:w="120"/>
+              <w:bottom w:type="dxa" w:w="80"/>
+              <w:right w:type="dxa" w:w="120"/>
+            </w:tcMar>
+          </w:tcPr>
+          <w:p>
+            <w:pPr>
+              <w:spacing w:after="0"/>
+            </w:pPr>
+            <w:r>
+              <w:rPr>
+                <w:rFonts w:ascii="Times New Roman" w:cs="Times New Roman" w:eastAsia="Times New Roman" w:hAnsi="Times New Roman"/>
+                <w:b w:val="false"/>
+                <w:bCs w:val="false"/>
+                <w:sz w:val="24"/>
+                <w:szCs w:val="24"/>
+              </w:rPr>
+              <w:t xml:space="preserve">0:05</w:t>
+            </w:r>
+          </w:p>
+        </w:tc>
+        <w:tc>
+          <w:tcPr>
+            <w:tcW w:type="dxa" w:w="900"/>
+            <w:tcMar>
+              <w:top w:type="dxa" w:w="80"/>
+              <w:left w:type="dxa" w:w="120"/>
+              <w:bottom w:type="dxa" w:w="80"/>
+              <w:right w:type="dxa" w:w="120"/>
+            </w:tcMar>
+          </w:tcPr>
+          <w:p>
+            <w:pPr>
+              <w:spacing w:after="0"/>
+            </w:pPr>
+            <w:r>
+              <w:rPr>
+                <w:rFonts w:ascii="Times New Roman" w:cs="Times New Roman" w:eastAsia="Times New Roman" w:hAnsi="Times New Roman"/>
+                <w:b w:val="false"/>
+                <w:bCs w:val="false"/>
+                <w:sz w:val="24"/>
+                <w:szCs w:val="24"/>
+              </w:rPr>
+              <w:t xml:space="preserve">0:30</w:t>
+            </w:r>
+          </w:p>
+        </w:tc>
+        <w:tc>
+          <w:tcPr>
+            <w:tcW w:type="dxa" w:w="1280"/>
+            <w:tcMar>
+              <w:top w:type="dxa" w:w="80"/>
+              <w:left w:type="dxa" w:w="120"/>
+              <w:bottom w:type="dxa" w:w="80"/>
+              <w:right w:type="dxa" w:w="120"/>
+            </w:tcMar>
+          </w:tcPr>
+          <w:p>
+            <w:pPr>
+              <w:spacing w:after="0"/>
+            </w:pPr>
+            <w:r>
+              <w:rPr>
+                <w:rFonts w:ascii="Times New Roman" w:cs="Times New Roman" w:eastAsia="Times New Roman" w:hAnsi="Times New Roman"/>
+                <w:b w:val="false"/>
+                <w:bCs w:val="false"/>
+                <w:sz w:val="24"/>
+                <w:szCs w:val="24"/>
+              </w:rPr>
+              <w:t xml:space="preserve">Despliegue</w:t>
+            </w:r>
+          </w:p>
+        </w:tc>
+        <w:tc>
+          <w:tcPr>
+            <w:tcW w:type="dxa" w:w="3800"/>
+            <w:tcMar>
+              <w:top w:type="dxa" w:w="80"/>
+              <w:left w:type="dxa" w:w="120"/>
+              <w:bottom w:type="dxa" w:w="80"/>
+              <w:right w:type="dxa" w:w="120"/>
+            </w:tcMar>
+          </w:tcPr>
+          <w:p>
+            <w:pPr>
+              <w:spacing w:after="0"/>
+            </w:pPr>
+            <w:r>
+              <w:rPr>
+                <w:rFonts w:ascii="Times New Roman" w:cs="Times New Roman" w:eastAsia="Times New Roman" w:hAnsi="Times New Roman"/>
+                <w:b w:val="false"/>
+                <w:bCs w:val="false"/>
+                <w:sz w:val="24"/>
+                <w:szCs w:val="24"/>
+              </w:rPr>
+              <w:t xml:space="preserve">Aplicación de la migración de las siglas en Railway mediante el túnel, tras recibir acceso al proyecto, y comprobación de las páginas afectadas.</w:t>
+            </w:r>
+          </w:p>
+        </w:tc>
+      </w:tr>
+      <w:tr>
+        <w:tc>
+          <w:tcPr>
+            <w:tcW w:type="dxa" w:w="900"/>
+            <w:tcMar>
+              <w:top w:type="dxa" w:w="80"/>
+              <w:left w:type="dxa" w:w="120"/>
+              <w:bottom w:type="dxa" w:w="80"/>
+              <w:right w:type="dxa" w:w="120"/>
+            </w:tcMar>
+          </w:tcPr>
+          <w:p>
+            <w:pPr>
+              <w:spacing w:after="0"/>
+            </w:pPr>
+            <w:r>
+              <w:rPr>
+                <w:rFonts w:ascii="Times New Roman" w:cs="Times New Roman" w:eastAsia="Times New Roman" w:hAnsi="Times New Roman"/>
+                <w:b w:val="false"/>
+                <w:bCs w:val="false"/>
+                <w:sz w:val="24"/>
+                <w:szCs w:val="24"/>
+              </w:rPr>
+              <w:t xml:space="preserve">08/10/2026</w:t>
+            </w:r>
+          </w:p>
+        </w:tc>
+        <w:tc>
+          <w:tcPr>
+            <w:tcW w:type="dxa" w:w="680"/>
+            <w:tcMar>
+              <w:top w:type="dxa" w:w="80"/>
+              <w:left w:type="dxa" w:w="120"/>
+              <w:bottom w:type="dxa" w:w="80"/>
+              <w:right w:type="dxa" w:w="120"/>
+            </w:tcMar>
+          </w:tcPr>
+          <w:p>
+            <w:pPr>
+              <w:spacing w:after="0"/>
+            </w:pPr>
+            <w:r>
+              <w:rPr>
+                <w:rFonts w:ascii="Times New Roman" w:cs="Times New Roman" w:eastAsia="Times New Roman" w:hAnsi="Times New Roman"/>
+                <w:b w:val="false"/>
+                <w:bCs w:val="false"/>
+                <w:sz w:val="24"/>
+                <w:szCs w:val="24"/>
+              </w:rPr>
+              <w:t xml:space="preserve">11:40</w:t>
+            </w:r>
+          </w:p>
+        </w:tc>
+        <w:tc>
+          <w:tcPr>
+            <w:tcW w:type="dxa" w:w="680"/>
+            <w:tcMar>
+              <w:top w:type="dxa" w:w="80"/>
+              <w:left w:type="dxa" w:w="120"/>
+              <w:bottom w:type="dxa" w:w="80"/>
+              <w:right w:type="dxa" w:w="120"/>
+            </w:tcMar>
+          </w:tcPr>
+          <w:p>
+            <w:pPr>
+              <w:spacing w:after="0"/>
+            </w:pPr>
+            <w:r>
+              <w:rPr>
+                <w:rFonts w:ascii="Times New Roman" w:cs="Times New Roman" w:eastAsia="Times New Roman" w:hAnsi="Times New Roman"/>
+                <w:b w:val="false"/>
+                <w:bCs w:val="false"/>
+                <w:sz w:val="24"/>
+                <w:szCs w:val="24"/>
+              </w:rPr>
+              <w:t xml:space="preserve">13:00</w:t>
+            </w:r>
+          </w:p>
+        </w:tc>
+        <w:tc>
+          <w:tcPr>
+            <w:tcW w:type="dxa" w:w="1120"/>
+            <w:tcMar>
+              <w:top w:type="dxa" w:w="80"/>
+              <w:left w:type="dxa" w:w="120"/>
+              <w:bottom w:type="dxa" w:w="80"/>
+              <w:right w:type="dxa" w:w="120"/>
+            </w:tcMar>
+          </w:tcPr>
+          <w:p>
+            <w:pPr>
+              <w:spacing w:after="0"/>
+            </w:pPr>
+            <w:r>
+              <w:rPr>
+                <w:rFonts w:ascii="Times New Roman" w:cs="Times New Roman" w:eastAsia="Times New Roman" w:hAnsi="Times New Roman"/>
+                <w:b w:val="false"/>
+                <w:bCs w:val="false"/>
+                <w:sz w:val="24"/>
+                <w:szCs w:val="24"/>
+              </w:rPr>
+              <w:t xml:space="preserve">0:10</w:t>
+            </w:r>
+          </w:p>
+        </w:tc>
+        <w:tc>
+          <w:tcPr>
+            <w:tcW w:type="dxa" w:w="900"/>
+            <w:tcMar>
+              <w:top w:type="dxa" w:w="80"/>
+              <w:left w:type="dxa" w:w="120"/>
+              <w:bottom w:type="dxa" w:w="80"/>
+              <w:right w:type="dxa" w:w="120"/>
+            </w:tcMar>
+          </w:tcPr>
+          <w:p>
+            <w:pPr>
+              <w:spacing w:after="0"/>
+            </w:pPr>
+            <w:r>
+              <w:rPr>
+                <w:rFonts w:ascii="Times New Roman" w:cs="Times New Roman" w:eastAsia="Times New Roman" w:hAnsi="Times New Roman"/>
+                <w:b w:val="false"/>
+                <w:bCs w:val="false"/>
+                <w:sz w:val="24"/>
+                <w:szCs w:val="24"/>
+              </w:rPr>
+              <w:t xml:space="preserve">1:10</w:t>
+            </w:r>
+          </w:p>
+        </w:tc>
+        <w:tc>
+          <w:tcPr>
+            <w:tcW w:type="dxa" w:w="1280"/>
+            <w:tcMar>
+              <w:top w:type="dxa" w:w="80"/>
+              <w:left w:type="dxa" w:w="120"/>
+              <w:bottom w:type="dxa" w:w="80"/>
+              <w:right w:type="dxa" w:w="120"/>
+            </w:tcMar>
+          </w:tcPr>
+          <w:p>
+            <w:pPr>
+              <w:spacing w:after="0"/>
+            </w:pPr>
+            <w:r>
+              <w:rPr>
+                <w:rFonts w:ascii="Times New Roman" w:cs="Times New Roman" w:eastAsia="Times New Roman" w:hAnsi="Times New Roman"/>
+                <w:b w:val="false"/>
+                <w:bCs w:val="false"/>
+                <w:sz w:val="24"/>
+                <w:szCs w:val="24"/>
+              </w:rPr>
+              <w:t xml:space="preserve">Diseño y codificación</w:t>
+            </w:r>
+          </w:p>
+        </w:tc>
+        <w:tc>
+          <w:tcPr>
+            <w:tcW w:type="dxa" w:w="3800"/>
+            <w:tcMar>
+              <w:top w:type="dxa" w:w="80"/>
+              <w:left w:type="dxa" w:w="120"/>
+              <w:bottom w:type="dxa" w:w="80"/>
+              <w:right w:type="dxa" w:w="120"/>
+            </w:tcMar>
+          </w:tcPr>
+          <w:p>
+            <w:pPr>
+              <w:spacing w:after="0"/>
+            </w:pPr>
+            <w:r>
+              <w:rPr>
+                <w:rFonts w:ascii="Times New Roman" w:cs="Times New Roman" w:eastAsia="Times New Roman" w:hAnsi="Times New Roman"/>
+                <w:b w:val="false"/>
+                <w:bCs w:val="false"/>
+                <w:sz w:val="24"/>
+                <w:szCs w:val="24"/>
+              </w:rPr>
+              <w:t xml:space="preserve">Portada con el titular revelado palabra por palabra y el carrusel de próximos eventos entre el texto y los botones.</w:t>
+            </w:r>
+          </w:p>
+        </w:tc>
+      </w:tr>
+      <w:tr>
+        <w:tc>
+          <w:tcPr>
+            <w:tcW w:type="dxa" w:w="900"/>
+            <w:tcMar>
+              <w:top w:type="dxa" w:w="80"/>
+              <w:left w:type="dxa" w:w="120"/>
+              <w:bottom w:type="dxa" w:w="80"/>
+              <w:right w:type="dxa" w:w="120"/>
+            </w:tcMar>
+          </w:tcPr>
+          <w:p>
+            <w:pPr>
+              <w:spacing w:after="0"/>
+            </w:pPr>
+            <w:r>
+              <w:rPr>
+                <w:rFonts w:ascii="Times New Roman" w:cs="Times New Roman" w:eastAsia="Times New Roman" w:hAnsi="Times New Roman"/>
+                <w:b w:val="false"/>
+                <w:bCs w:val="false"/>
+                <w:sz w:val="24"/>
+                <w:szCs w:val="24"/>
+              </w:rPr>
+              <w:t xml:space="preserve">08/10/2026</w:t>
+            </w:r>
+          </w:p>
+        </w:tc>
+        <w:tc>
+          <w:tcPr>
+            <w:tcW w:type="dxa" w:w="680"/>
+            <w:tcMar>
+              <w:top w:type="dxa" w:w="80"/>
+              <w:left w:type="dxa" w:w="120"/>
+              <w:bottom w:type="dxa" w:w="80"/>
+              <w:right w:type="dxa" w:w="120"/>
+            </w:tcMar>
+          </w:tcPr>
+          <w:p>
+            <w:pPr>
+              <w:spacing w:after="0"/>
+            </w:pPr>
+            <w:r>
+              <w:rPr>
+                <w:rFonts w:ascii="Times New Roman" w:cs="Times New Roman" w:eastAsia="Times New Roman" w:hAnsi="Times New Roman"/>
+                <w:b w:val="false"/>
+                <w:bCs w:val="false"/>
+                <w:sz w:val="24"/>
+                <w:szCs w:val="24"/>
+              </w:rPr>
+              <w:t xml:space="preserve">14:20</w:t>
+            </w:r>
+          </w:p>
+        </w:tc>
+        <w:tc>
+          <w:tcPr>
+            <w:tcW w:type="dxa" w:w="680"/>
+            <w:tcMar>
+              <w:top w:type="dxa" w:w="80"/>
+              <w:left w:type="dxa" w:w="120"/>
+              <w:bottom w:type="dxa" w:w="80"/>
+              <w:right w:type="dxa" w:w="120"/>
+            </w:tcMar>
+          </w:tcPr>
+          <w:p>
+            <w:pPr>
+              <w:spacing w:after="0"/>
+            </w:pPr>
+            <w:r>
+              <w:rPr>
+                <w:rFonts w:ascii="Times New Roman" w:cs="Times New Roman" w:eastAsia="Times New Roman" w:hAnsi="Times New Roman"/>
+                <w:b w:val="false"/>
+                <w:bCs w:val="false"/>
+                <w:sz w:val="24"/>
+                <w:szCs w:val="24"/>
+              </w:rPr>
+              <w:t xml:space="preserve">15:20</w:t>
+            </w:r>
+          </w:p>
+        </w:tc>
+        <w:tc>
+          <w:tcPr>
+            <w:tcW w:type="dxa" w:w="1120"/>
+            <w:tcMar>
+              <w:top w:type="dxa" w:w="80"/>
+              <w:left w:type="dxa" w:w="120"/>
+              <w:bottom w:type="dxa" w:w="80"/>
+              <w:right w:type="dxa" w:w="120"/>
+            </w:tcMar>
+          </w:tcPr>
+          <w:p>
+            <w:pPr>
+              <w:spacing w:after="0"/>
+            </w:pPr>
+            <w:r>
+              <w:rPr>
+                <w:rFonts w:ascii="Times New Roman" w:cs="Times New Roman" w:eastAsia="Times New Roman" w:hAnsi="Times New Roman"/>
+                <w:b w:val="false"/>
+                <w:bCs w:val="false"/>
+                <w:sz w:val="24"/>
+                <w:szCs w:val="24"/>
+              </w:rPr>
+              <w:t xml:space="preserve">0:10</w:t>
+            </w:r>
+          </w:p>
+        </w:tc>
+        <w:tc>
+          <w:tcPr>
+            <w:tcW w:type="dxa" w:w="900"/>
+            <w:tcMar>
+              <w:top w:type="dxa" w:w="80"/>
+              <w:left w:type="dxa" w:w="120"/>
+              <w:bottom w:type="dxa" w:w="80"/>
+              <w:right w:type="dxa" w:w="120"/>
+            </w:tcMar>
+          </w:tcPr>
+          <w:p>
+            <w:pPr>
+              <w:spacing w:after="0"/>
+            </w:pPr>
+            <w:r>
+              <w:rPr>
+                <w:rFonts w:ascii="Times New Roman" w:cs="Times New Roman" w:eastAsia="Times New Roman" w:hAnsi="Times New Roman"/>
+                <w:b w:val="false"/>
+                <w:bCs w:val="false"/>
+                <w:sz w:val="24"/>
+                <w:szCs w:val="24"/>
+              </w:rPr>
+              <w:t xml:space="preserve">0:50</w:t>
+            </w:r>
+          </w:p>
+        </w:tc>
+        <w:tc>
+          <w:tcPr>
+            <w:tcW w:type="dxa" w:w="1280"/>
+            <w:tcMar>
+              <w:top w:type="dxa" w:w="80"/>
+              <w:left w:type="dxa" w:w="120"/>
+              <w:bottom w:type="dxa" w:w="80"/>
+              <w:right w:type="dxa" w:w="120"/>
+            </w:tcMar>
+          </w:tcPr>
+          <w:p>
+            <w:pPr>
+              <w:spacing w:after="0"/>
+            </w:pPr>
+            <w:r>
+              <w:rPr>
+                <w:rFonts w:ascii="Times New Roman" w:cs="Times New Roman" w:eastAsia="Times New Roman" w:hAnsi="Times New Roman"/>
+                <w:b w:val="false"/>
+                <w:bCs w:val="false"/>
+                <w:sz w:val="24"/>
+                <w:szCs w:val="24"/>
+              </w:rPr>
+              <w:t xml:space="preserve">Diseño y codificación</w:t>
+            </w:r>
+          </w:p>
+        </w:tc>
+        <w:tc>
+          <w:tcPr>
+            <w:tcW w:type="dxa" w:w="3800"/>
+            <w:tcMar>
+              <w:top w:type="dxa" w:w="80"/>
+              <w:left w:type="dxa" w:w="120"/>
+              <w:bottom w:type="dxa" w:w="80"/>
+              <w:right w:type="dxa" w:w="120"/>
+            </w:tcMar>
+          </w:tcPr>
+          <w:p>
+            <w:pPr>
+              <w:spacing w:after="0"/>
+            </w:pPr>
+            <w:r>
+              <w:rPr>
+                <w:rFonts w:ascii="Times New Roman" w:cs="Times New Roman" w:eastAsia="Times New Roman" w:hAnsi="Times New Roman"/>
+                <w:b w:val="false"/>
+                <w:bCs w:val="false"/>
+                <w:sz w:val="24"/>
+                <w:szCs w:val="24"/>
+              </w:rPr>
+              <w:t xml:space="preserve">Rediseño del carrusel con la imagen de cada evento, flechas y pausa al pasar el cursor. Estudiantes como segunda sección del panel.</w:t>
+            </w:r>
+          </w:p>
+        </w:tc>
+      </w:tr>
+      <w:tr>
+        <w:tc>
+          <w:tcPr>
+            <w:tcW w:type="dxa" w:w="900"/>
+            <w:tcMar>
+              <w:top w:type="dxa" w:w="80"/>
+              <w:left w:type="dxa" w:w="120"/>
+              <w:bottom w:type="dxa" w:w="80"/>
+              <w:right w:type="dxa" w:w="120"/>
+            </w:tcMar>
+          </w:tcPr>
+          <w:p>
+            <w:pPr>
+              <w:spacing w:after="0"/>
+            </w:pPr>
+            <w:r>
+              <w:rPr>
+                <w:rFonts w:ascii="Times New Roman" w:cs="Times New Roman" w:eastAsia="Times New Roman" w:hAnsi="Times New Roman"/>
+                <w:b w:val="false"/>
+                <w:bCs w:val="false"/>
+                <w:sz w:val="24"/>
+                <w:szCs w:val="24"/>
+              </w:rPr>
+              <w:t xml:space="preserve">08/10/2026</w:t>
+            </w:r>
+          </w:p>
+        </w:tc>
+        <w:tc>
+          <w:tcPr>
+            <w:tcW w:type="dxa" w:w="680"/>
+            <w:tcMar>
+              <w:top w:type="dxa" w:w="80"/>
+              <w:left w:type="dxa" w:w="120"/>
+              <w:bottom w:type="dxa" w:w="80"/>
+              <w:right w:type="dxa" w:w="120"/>
+            </w:tcMar>
+          </w:tcPr>
+          <w:p>
+            <w:pPr>
+              <w:spacing w:after="0"/>
+            </w:pPr>
+            <w:r>
+              <w:rPr>
+                <w:rFonts w:ascii="Times New Roman" w:cs="Times New Roman" w:eastAsia="Times New Roman" w:hAnsi="Times New Roman"/>
+                <w:b w:val="false"/>
+                <w:bCs w:val="false"/>
+                <w:sz w:val="24"/>
+                <w:szCs w:val="24"/>
+              </w:rPr>
+              <w:t xml:space="preserve">16:00</w:t>
+            </w:r>
+          </w:p>
+        </w:tc>
+        <w:tc>
+          <w:tcPr>
+            <w:tcW w:type="dxa" w:w="680"/>
+            <w:tcMar>
+              <w:top w:type="dxa" w:w="80"/>
+              <w:left w:type="dxa" w:w="120"/>
+              <w:bottom w:type="dxa" w:w="80"/>
+              <w:right w:type="dxa" w:w="120"/>
+            </w:tcMar>
+          </w:tcPr>
+          <w:p>
+            <w:pPr>
+              <w:spacing w:after="0"/>
+            </w:pPr>
+            <w:r>
+              <w:rPr>
+                <w:rFonts w:ascii="Times New Roman" w:cs="Times New Roman" w:eastAsia="Times New Roman" w:hAnsi="Times New Roman"/>
+                <w:b w:val="false"/>
+                <w:bCs w:val="false"/>
+                <w:sz w:val="24"/>
+                <w:szCs w:val="24"/>
+              </w:rPr>
+              <w:t xml:space="preserve">16:55</w:t>
+            </w:r>
+          </w:p>
+        </w:tc>
+        <w:tc>
+          <w:tcPr>
+            <w:tcW w:type="dxa" w:w="1120"/>
+            <w:tcMar>
+              <w:top w:type="dxa" w:w="80"/>
+              <w:left w:type="dxa" w:w="120"/>
+              <w:bottom w:type="dxa" w:w="80"/>
+              <w:right w:type="dxa" w:w="120"/>
+            </w:tcMar>
+          </w:tcPr>
+          <w:p>
+            <w:pPr>
+              <w:spacing w:after="0"/>
+            </w:pPr>
+            <w:r>
+              <w:rPr>
+                <w:rFonts w:ascii="Times New Roman" w:cs="Times New Roman" w:eastAsia="Times New Roman" w:hAnsi="Times New Roman"/>
+                <w:b w:val="false"/>
+                <w:bCs w:val="false"/>
+                <w:sz w:val="24"/>
+                <w:szCs w:val="24"/>
+              </w:rPr>
+              <w:t xml:space="preserve">0:05</w:t>
+            </w:r>
+          </w:p>
+        </w:tc>
+        <w:tc>
+          <w:tcPr>
+            <w:tcW w:type="dxa" w:w="900"/>
+            <w:tcMar>
+              <w:top w:type="dxa" w:w="80"/>
+              <w:left w:type="dxa" w:w="120"/>
+              <w:bottom w:type="dxa" w:w="80"/>
+              <w:right w:type="dxa" w:w="120"/>
+            </w:tcMar>
+          </w:tcPr>
+          <w:p>
+            <w:pPr>
+              <w:spacing w:after="0"/>
+            </w:pPr>
+            <w:r>
+              <w:rPr>
+                <w:rFonts w:ascii="Times New Roman" w:cs="Times New Roman" w:eastAsia="Times New Roman" w:hAnsi="Times New Roman"/>
+                <w:b w:val="false"/>
+                <w:bCs w:val="false"/>
+                <w:sz w:val="24"/>
+                <w:szCs w:val="24"/>
+              </w:rPr>
+              <w:t xml:space="preserve">0:50</w:t>
+            </w:r>
+          </w:p>
+        </w:tc>
+        <w:tc>
+          <w:tcPr>
+            <w:tcW w:type="dxa" w:w="1280"/>
+            <w:tcMar>
+              <w:top w:type="dxa" w:w="80"/>
+              <w:left w:type="dxa" w:w="120"/>
+              <w:bottom w:type="dxa" w:w="80"/>
+              <w:right w:type="dxa" w:w="120"/>
+            </w:tcMar>
+          </w:tcPr>
+          <w:p>
+            <w:pPr>
+              <w:spacing w:after="0"/>
+            </w:pPr>
+            <w:r>
+              <w:rPr>
+                <w:rFonts w:ascii="Times New Roman" w:cs="Times New Roman" w:eastAsia="Times New Roman" w:hAnsi="Times New Roman"/>
+                <w:b w:val="false"/>
+                <w:bCs w:val="false"/>
+                <w:sz w:val="24"/>
+                <w:szCs w:val="24"/>
+              </w:rPr>
+              <w:t xml:space="preserve">Diseño</w:t>
+            </w:r>
+          </w:p>
+        </w:tc>
+        <w:tc>
+          <w:tcPr>
+            <w:tcW w:type="dxa" w:w="3800"/>
+            <w:tcMar>
+              <w:top w:type="dxa" w:w="80"/>
+              <w:left w:type="dxa" w:w="120"/>
+              <w:bottom w:type="dxa" w:w="80"/>
+              <w:right w:type="dxa" w:w="120"/>
+            </w:tcMar>
+          </w:tcPr>
+          <w:p>
+            <w:pPr>
+              <w:spacing w:after="0"/>
+            </w:pPr>
+            <w:r>
+              <w:rPr>
+                <w:rFonts w:ascii="Times New Roman" w:cs="Times New Roman" w:eastAsia="Times New Roman" w:hAnsi="Times New Roman"/>
+                <w:b w:val="false"/>
+                <w:bCs w:val="false"/>
+                <w:sz w:val="24"/>
+                <w:szCs w:val="24"/>
+              </w:rPr>
+              <w:t xml:space="preserve">Logotipos e ilustraciones del contenido de demostración, generados por script. Integración de los ajustes a main.</w:t>
+            </w:r>
+          </w:p>
+        </w:tc>
+      </w:tr>
     </w:tbl>
     <w:p>
       <w:pPr>
@@ -9938,7 +12808,7 @@
                 <w:sz w:val="24"/>
                 <w:szCs w:val="24"/>
               </w:rPr>
-              <w:t xml:space="preserve">2.4</w:t>
+              <w:t xml:space="preserve">2.5</w:t>
             </w:r>
           </w:p>
         </w:tc>
@@ -10366,6 +13236,86 @@
                 <w:sz w:val="24"/>
                 <w:szCs w:val="24"/>
               </w:rPr>
+              <w:t xml:space="preserve">Ajustes finales del sprint</w:t>
+            </w:r>
+          </w:p>
+        </w:tc>
+        <w:tc>
+          <w:tcPr>
+            <w:tcW w:type="dxa" w:w="1900"/>
+            <w:tcMar>
+              <w:top w:type="dxa" w:w="80"/>
+              <w:left w:type="dxa" w:w="120"/>
+              <w:bottom w:type="dxa" w:w="80"/>
+              <w:right w:type="dxa" w:w="120"/>
+            </w:tcMar>
+          </w:tcPr>
+          <w:p>
+            <w:pPr>
+              <w:spacing w:after="0"/>
+            </w:pPr>
+            <w:r>
+              <w:rPr>
+                <w:rFonts w:ascii="Times New Roman" w:cs="Times New Roman" w:eastAsia="Times New Roman" w:hAnsi="Times New Roman"/>
+                <w:b w:val="false"/>
+                <w:bCs w:val="false"/>
+                <w:sz w:val="24"/>
+                <w:szCs w:val="24"/>
+              </w:rPr>
+              <w:t xml:space="preserve">5:45</w:t>
+            </w:r>
+          </w:p>
+        </w:tc>
+        <w:tc>
+          <w:tcPr>
+            <w:tcW w:type="dxa" w:w="1900"/>
+            <w:tcMar>
+              <w:top w:type="dxa" w:w="80"/>
+              <w:left w:type="dxa" w:w="120"/>
+              <w:bottom w:type="dxa" w:w="80"/>
+              <w:right w:type="dxa" w:w="120"/>
+            </w:tcMar>
+          </w:tcPr>
+          <w:p>
+            <w:pPr>
+              <w:spacing w:after="0"/>
+            </w:pPr>
+            <w:r>
+              <w:rPr>
+                <w:rFonts w:ascii="Times New Roman" w:cs="Times New Roman" w:eastAsia="Times New Roman" w:hAnsi="Times New Roman"/>
+                <w:b w:val="false"/>
+                <w:bCs w:val="false"/>
+                <w:sz w:val="24"/>
+                <w:szCs w:val="24"/>
+              </w:rPr>
+              <w:t xml:space="preserve">5.7</w:t>
+            </w:r>
+          </w:p>
+        </w:tc>
+      </w:tr>
+      <w:tr>
+        <w:tc>
+          <w:tcPr>
+            <w:tcW w:type="dxa" w:w="5560"/>
+            <w:tcMar>
+              <w:top w:type="dxa" w:w="80"/>
+              <w:left w:type="dxa" w:w="120"/>
+              <w:bottom w:type="dxa" w:w="80"/>
+              <w:right w:type="dxa" w:w="120"/>
+            </w:tcMar>
+          </w:tcPr>
+          <w:p>
+            <w:pPr>
+              <w:spacing w:after="0"/>
+            </w:pPr>
+            <w:r>
+              <w:rPr>
+                <w:rFonts w:ascii="Times New Roman" w:cs="Times New Roman" w:eastAsia="Times New Roman" w:hAnsi="Times New Roman"/>
+                <w:b w:val="false"/>
+                <w:bCs w:val="false"/>
+                <w:sz w:val="24"/>
+                <w:szCs w:val="24"/>
+              </w:rPr>
               <w:t xml:space="preserve">Total</w:t>
             </w:r>
           </w:p>
@@ -10392,7 +13342,7 @@
                 <w:sz w:val="24"/>
                 <w:szCs w:val="24"/>
               </w:rPr>
-              <w:t xml:space="preserve">11:00</w:t>
+              <w:t xml:space="preserve">16:45</w:t>
             </w:r>
           </w:p>
         </w:tc>
@@ -10418,7 +13368,7 @@
                 <w:sz w:val="24"/>
                 <w:szCs w:val="24"/>
               </w:rPr>
-              <w:t xml:space="preserve">11.0</w:t>
+              <w:t xml:space="preserve">16.8</w:t>
             </w:r>
           </w:p>
         </w:tc>
@@ -10438,7 +13388,7 @@
           <w:sz w:val="30"/>
           <w:szCs w:val="30"/>
         </w:rPr>
-        <w:t xml:space="preserve">10.3. Resumen del equipo</w:t>
+        <w:t xml:space="preserve">11.3. Resumen del equipo</w:t>
       </w:r>
     </w:p>
     <w:p>
@@ -10626,7 +13576,7 @@
                 <w:sz w:val="24"/>
                 <w:szCs w:val="24"/>
               </w:rPr>
-              <w:t xml:space="preserve">19</w:t>
+              <w:t xml:space="preserve">25</w:t>
             </w:r>
           </w:p>
         </w:tc>
@@ -10652,7 +13602,7 @@
                 <w:sz w:val="24"/>
                 <w:szCs w:val="24"/>
               </w:rPr>
-              <w:t xml:space="preserve">18:00</w:t>
+              <w:t xml:space="preserve">24:10</w:t>
             </w:r>
           </w:p>
         </w:tc>
@@ -10678,7 +13628,7 @@
                 <w:sz w:val="24"/>
                 <w:szCs w:val="24"/>
               </w:rPr>
-              <w:t xml:space="preserve">18.0</w:t>
+              <w:t xml:space="preserve">24.2</w:t>
             </w:r>
           </w:p>
         </w:tc>
@@ -10732,7 +13682,7 @@
                 <w:sz w:val="24"/>
                 <w:szCs w:val="24"/>
               </w:rPr>
-              <w:t xml:space="preserve">13</w:t>
+              <w:t xml:space="preserve">19</w:t>
             </w:r>
           </w:p>
         </w:tc>
@@ -10758,7 +13708,7 @@
                 <w:sz w:val="24"/>
                 <w:szCs w:val="24"/>
               </w:rPr>
-              <w:t xml:space="preserve">11:00</w:t>
+              <w:t xml:space="preserve">16:45</w:t>
             </w:r>
           </w:p>
         </w:tc>
@@ -10784,7 +13734,7 @@
                 <w:sz w:val="24"/>
                 <w:szCs w:val="24"/>
               </w:rPr>
-              <w:t xml:space="preserve">11.0</w:t>
+              <w:t xml:space="preserve">16.8</w:t>
             </w:r>
           </w:p>
         </w:tc>
@@ -10838,7 +13788,7 @@
                 <w:sz w:val="24"/>
                 <w:szCs w:val="24"/>
               </w:rPr>
-              <w:t xml:space="preserve">32</w:t>
+              <w:t xml:space="preserve">44</w:t>
             </w:r>
           </w:p>
         </w:tc>
@@ -10864,7 +13814,7 @@
                 <w:sz w:val="24"/>
                 <w:szCs w:val="24"/>
               </w:rPr>
-              <w:t xml:space="preserve">29:00</w:t>
+              <w:t xml:space="preserve">40:55</w:t>
             </w:r>
           </w:p>
         </w:tc>
@@ -10890,7 +13840,7 @@
                 <w:sz w:val="24"/>
                 <w:szCs w:val="24"/>
               </w:rPr>
-              <w:t xml:space="preserve">29.0</w:t>
+              <w:t xml:space="preserve">40.9</w:t>
             </w:r>
           </w:p>
         </w:tc>
@@ -10912,7 +13862,7 @@
           <w:sz w:val="24"/>
           <w:szCs w:val="24"/>
         </w:rPr>
-        <w:t xml:space="preserve">El reparto del trabajo siguió las responsabilidades acordadas: Harry Méndez asumió la migración, las consultas, los servicios de administración, el perfil y las pruebas automatizadas; Juan Gabriel Gualim, las pantallas públicas, los componentes compartidos de las dos secciones y los formularios del panel. Las sesiones en las que participaron ambos corresponden a la planificación del sprint y a la revisión final del código. El resumen por historia asigna cada sesión a la historia predominante en ella.</w:t>
+        <w:t xml:space="preserve">El reparto del trabajo siguió las responsabilidades acordadas: Harry Méndez asumió la migración, las consultas, los servicios de administración, el perfil y las pruebas automatizadas; Juan Gabriel Gualim, las pantallas públicas, los componentes compartidos de las dos secciones y los formularios del panel. En los ajustes finales se mantuvo el mismo criterio: Harry Méndez se encargó de la migración de las siglas, la selección de eventos del carrusel, la carga del contenido de demostración y la operación de Railway, y Juan Gabriel Gualim de los campos obligatorios, las tarjetas, la nueva portada y las ilustraciones. Las sesiones en las que participaron ambos corresponden a la planificación del sprint y a la revisión final del código. El resumen por historia asigna cada sesión a la historia predominante en ella.</w:t>
       </w:r>
     </w:p>
     <w:sectPr>

</xml_diff>